<commit_message>
casos de uso y rf finalizados
</commit_message>
<xml_diff>
--- a/docs/anteproyecto/Espicifiacion casos de uso PT.docx
+++ b/docs/anteproyecto/Espicifiacion casos de uso PT.docx
@@ -1691,7 +1691,21 @@
                 <w:rStyle w:val="Hipervnculo"/>
                 <w:noProof/>
               </w:rPr>
-              <w:t>CU19- Sincronizar con calendario Externo</w:t>
+              <w:t>CU19- Sincro</w:t>
+            </w:r>
+            <w:r>
+              <w:rPr>
+                <w:rStyle w:val="Hipervnculo"/>
+                <w:noProof/>
+              </w:rPr>
+              <w:t>n</w:t>
+            </w:r>
+            <w:r>
+              <w:rPr>
+                <w:rStyle w:val="Hipervnculo"/>
+                <w:noProof/>
+              </w:rPr>
+              <w:t>izar con calendario Externo</w:t>
             </w:r>
             <w:r>
               <w:rPr>
@@ -2348,7 +2362,21 @@
                 <w:rStyle w:val="Hipervnculo"/>
                 <w:noProof/>
               </w:rPr>
-              <w:t>CU28-Home del PT</w:t>
+              <w:t>CU28-</w:t>
+            </w:r>
+            <w:r>
+              <w:rPr>
+                <w:rStyle w:val="Hipervnculo"/>
+                <w:noProof/>
+              </w:rPr>
+              <w:t xml:space="preserve">      </w:t>
+            </w:r>
+            <w:r>
+              <w:rPr>
+                <w:rStyle w:val="Hipervnculo"/>
+                <w:noProof/>
+              </w:rPr>
+              <w:t>Home del PT</w:t>
             </w:r>
             <w:r>
               <w:rPr>
@@ -6450,7 +6478,13 @@
           </w:tcPr>
           <w:p>
             <w:r>
-              <w:t>Redirige al Home del PT (CU27)</w:t>
+              <w:t>Redirige al Home del PT (CU2</w:t>
+            </w:r>
+            <w:r>
+              <w:t>8</w:t>
+            </w:r>
+            <w:r>
+              <w:t>)</w:t>
             </w:r>
           </w:p>
         </w:tc>
@@ -9718,7 +9752,10 @@
           </w:tcPr>
           <w:p>
             <w:r>
-              <w:t>Acepta el deslinde de responsabilidad específico de esa Organización; el sistema registra la aceptación con fecha y hora</w:t>
+              <w:t>R</w:t>
+            </w:r>
+            <w:r>
+              <w:t>ecibe el aviso de que su historial médico será visible para la Organización y acepta el deslinde de responsabilidad específico de esa Organización; el sistema registra la aceptación con fecha y hora.</w:t>
             </w:r>
           </w:p>
         </w:tc>
@@ -10489,7 +10526,13 @@
               <w:t xml:space="preserve">Accede al listado de alumnos de su Organización </w:t>
             </w:r>
             <w:r>
-              <w:t>(desde CU27, Home del PT)</w:t>
+              <w:t>(desde CU2</w:t>
+            </w:r>
+            <w:r>
+              <w:t>8</w:t>
+            </w:r>
+            <w:r>
+              <w:t>, Home del PT)</w:t>
             </w:r>
           </w:p>
         </w:tc>
@@ -10886,6 +10929,7 @@
         <w:rPr>
           <w:noProof/>
         </w:rPr>
+        <w:lastRenderedPageBreak/>
         <w:drawing>
           <wp:inline distT="0" distB="0" distL="0" distR="0" wp14:anchorId="307EECA2" wp14:editId="1048C0D2">
             <wp:extent cx="4174435" cy="2875763"/>
@@ -11345,7 +11389,6 @@
                 <w:b/>
                 <w:bCs/>
               </w:rPr>
-              <w:lastRenderedPageBreak/>
               <w:t>Paso</w:t>
             </w:r>
           </w:p>
@@ -11654,6 +11697,7 @@
           <w:b/>
           <w:bCs/>
         </w:rPr>
+        <w:lastRenderedPageBreak/>
         <w:t>A2 – Cuotas pendientes:</w:t>
       </w:r>
       <w:r>
@@ -12109,7 +12153,6 @@
                 <w:b/>
                 <w:bCs/>
               </w:rPr>
-              <w:lastRenderedPageBreak/>
               <w:t>Prioridad (MoSCoW)</w:t>
             </w:r>
           </w:p>
@@ -12472,7 +12515,13 @@
               <w:t>Selecciona un alumno desde el listado de su Organización (</w:t>
             </w:r>
             <w:r>
-              <w:t>CU27, Home del PT</w:t>
+              <w:t>CU2</w:t>
+            </w:r>
+            <w:r>
+              <w:t>8</w:t>
+            </w:r>
+            <w:r>
+              <w:t>, Home del PT</w:t>
             </w:r>
             <w:r>
               <w:t>)</w:t>
@@ -12503,6 +12552,7 @@
                 <w:b/>
                 <w:bCs/>
               </w:rPr>
+              <w:lastRenderedPageBreak/>
               <w:t>2</w:t>
             </w:r>
           </w:p>
@@ -12539,13 +12589,88 @@
               <w:t xml:space="preserve">, </w:t>
             </w:r>
             <w:r>
-              <w:t>un resumen de hoy: la próxima sesión con el alumno (CU17), la rutina que le toca hoy (CU13) con su detalle, un aviso si tiene un examen agendado hoy (CU17) y un aviso si tiene cuotas impagas (CU20)</w:t>
-            </w:r>
-            <w:r>
-              <w:t xml:space="preserve"> y accesos a cada sección: </w:t>
-            </w:r>
-            <w:r>
-              <w:t>accesos a cada sección: historial médico (CU11), rutina (CU13), sesiones de entrenamiento (CU15), agenda (CU17), pagos (CU20), datos biométricos y medidas (CU22, CU23), progresión (CU24, CU25) y edición de datos (CU8).”</w:t>
+              <w:t>un resumen de hoy: la próxima sesión con el alumno (CU1</w:t>
+            </w:r>
+            <w:r>
+              <w:t>8</w:t>
+            </w:r>
+            <w:r>
+              <w:t>), la rutina que le toca hoy (CU1</w:t>
+            </w:r>
+            <w:r>
+              <w:t>4</w:t>
+            </w:r>
+            <w:r>
+              <w:t xml:space="preserve">) con su detalle, </w:t>
+            </w:r>
+            <w:r>
+              <w:t>un aviso si tiene una evaluación física agendada hoy y las notas de agenda del alumno (CU18)</w:t>
+            </w:r>
+            <w:r>
+              <w:t xml:space="preserve"> </w:t>
+            </w:r>
+            <w:r>
+              <w:t>y un aviso si tiene cuotas impagas (CU2</w:t>
+            </w:r>
+            <w:r>
+              <w:t>1</w:t>
+            </w:r>
+            <w:r>
+              <w:t>)</w:t>
+            </w:r>
+            <w:r>
+              <w:t xml:space="preserve"> y accesos a cada sección</w:t>
+            </w:r>
+            <w:r>
+              <w:t>: historial médico (CU11), rutina (CU1</w:t>
+            </w:r>
+            <w:r>
+              <w:t>4</w:t>
+            </w:r>
+            <w:r>
+              <w:t>), sesiones de entrenamiento (CU1</w:t>
+            </w:r>
+            <w:r>
+              <w:t>6</w:t>
+            </w:r>
+            <w:r>
+              <w:t>), agenda (CU1</w:t>
+            </w:r>
+            <w:r>
+              <w:t>8</w:t>
+            </w:r>
+            <w:r>
+              <w:t>), pagos (CU2</w:t>
+            </w:r>
+            <w:r>
+              <w:t>1</w:t>
+            </w:r>
+            <w:r>
+              <w:t>), datos biométricos y medidas (CU2</w:t>
+            </w:r>
+            <w:r>
+              <w:t>3</w:t>
+            </w:r>
+            <w:r>
+              <w:t>, CU2</w:t>
+            </w:r>
+            <w:r>
+              <w:t>4</w:t>
+            </w:r>
+            <w:r>
+              <w:t>), progresión (CU2</w:t>
+            </w:r>
+            <w:r>
+              <w:t>5</w:t>
+            </w:r>
+            <w:r>
+              <w:t>, CU2</w:t>
+            </w:r>
+            <w:r>
+              <w:t>6</w:t>
+            </w:r>
+            <w:r>
+              <w:t>) y edición de datos (CU8).</w:t>
             </w:r>
           </w:p>
         </w:tc>
@@ -12783,7 +12908,6 @@
         <w:rPr>
           <w:noProof/>
         </w:rPr>
-        <w:lastRenderedPageBreak/>
         <w:drawing>
           <wp:inline distT="0" distB="0" distL="0" distR="0" wp14:anchorId="44728D87" wp14:editId="79AC41BE">
             <wp:extent cx="4553482" cy="3363402"/>
@@ -13039,6 +13163,7 @@
                 <w:b/>
                 <w:bCs/>
               </w:rPr>
+              <w:lastRenderedPageBreak/>
               <w:t>Precondición</w:t>
             </w:r>
           </w:p>
@@ -13090,7 +13215,13 @@
           </w:tcPr>
           <w:p>
             <w:r>
-              <w:t>El historial médico del alumno queda actualizado, con el cambio registrado (RG-05), y disponible para consulta desde la ficha del alumno (CU10) y para la validación de contraindicaciones al armar rutinas (CU13)</w:t>
+              <w:t>El historial médico del alumno queda actualizado, con el cambio registrado (RG-05), y disponible para consulta desde la ficha del alumno (CU10) y para la validación de contraindicaciones al armar rutinas (CU1</w:t>
+            </w:r>
+            <w:r>
+              <w:t>4</w:t>
+            </w:r>
+            <w:r>
+              <w:t>)</w:t>
             </w:r>
           </w:p>
         </w:tc>
@@ -13537,7 +13668,6 @@
                 <w:b/>
                 <w:bCs/>
               </w:rPr>
-              <w:lastRenderedPageBreak/>
               <w:t>5</w:t>
             </w:r>
           </w:p>
@@ -13898,6 +14028,7 @@
         <w:rPr>
           <w:noProof/>
         </w:rPr>
+        <w:lastRenderedPageBreak/>
         <w:drawing>
           <wp:inline distT="0" distB="0" distL="0" distR="0" wp14:anchorId="6672489A" wp14:editId="49582837">
             <wp:extent cx="4461468" cy="3189164"/>
@@ -14155,7 +14286,6 @@
                 <w:b/>
                 <w:bCs/>
               </w:rPr>
-              <w:lastRenderedPageBreak/>
               <w:t>Precondición</w:t>
             </w:r>
           </w:p>
@@ -14765,6 +14895,7 @@
           <w:b/>
           <w:bCs/>
         </w:rPr>
+        <w:lastRenderedPageBreak/>
         <w:t>A2 – Crear un ejercicio propio:</w:t>
       </w:r>
       <w:r>
@@ -14812,7 +14943,7 @@
           <w:noProof/>
         </w:rPr>
         <w:drawing>
-          <wp:inline distT="0" distB="0" distL="0" distR="0" wp14:anchorId="68F4FA3F" wp14:editId="0D1F5326">
+          <wp:inline distT="0" distB="0" distL="0" distR="0" wp14:anchorId="68F4FA3F" wp14:editId="65672E51">
             <wp:extent cx="3705308" cy="2881815"/>
             <wp:effectExtent l="0" t="0" r="0" b="0"/>
             <wp:docPr id="2088025934" name="Imagen 3"/>
@@ -14904,7 +15035,6 @@
                 <w:b/>
                 <w:bCs/>
               </w:rPr>
-              <w:lastRenderedPageBreak/>
               <w:t>Campo</w:t>
             </w:r>
           </w:p>
@@ -15560,6 +15690,7 @@
           <w:b/>
           <w:bCs/>
         </w:rPr>
+        <w:lastRenderedPageBreak/>
         <w:t>A1 – Editar un ejercicio propio:</w:t>
       </w:r>
       <w:r>
@@ -15969,7 +16100,6 @@
                 <w:b/>
                 <w:bCs/>
               </w:rPr>
-              <w:lastRenderedPageBreak/>
               <w:t>Postcondición de éxito</w:t>
             </w:r>
           </w:p>
@@ -16914,7 +17044,6 @@
         <w:rPr>
           <w:noProof/>
         </w:rPr>
-        <w:lastRenderedPageBreak/>
         <w:drawing>
           <wp:inline distT="0" distB="0" distL="0" distR="0" wp14:anchorId="48EC3AB6" wp14:editId="2995334E">
             <wp:extent cx="4995202" cy="3570136"/>
@@ -17534,6 +17663,7 @@
                 <w:b/>
                 <w:bCs/>
               </w:rPr>
+              <w:lastRenderedPageBreak/>
               <w:t>2</w:t>
             </w:r>
           </w:p>
@@ -17836,7 +17966,6 @@
                 <w:b/>
                 <w:bCs/>
               </w:rPr>
-              <w:lastRenderedPageBreak/>
               <w:t>7</w:t>
             </w:r>
           </w:p>
@@ -18393,7 +18522,6 @@
                 <w:b/>
                 <w:bCs/>
               </w:rPr>
-              <w:lastRenderedPageBreak/>
               <w:t>Precondición</w:t>
             </w:r>
           </w:p>
@@ -19321,7 +19449,6 @@
         <w:rPr>
           <w:noProof/>
         </w:rPr>
-        <w:lastRenderedPageBreak/>
         <w:drawing>
           <wp:inline distT="0" distB="0" distL="0" distR="0" wp14:anchorId="68DC01EA" wp14:editId="7D70C0C7">
             <wp:extent cx="1385408" cy="3222384"/>
@@ -20288,6 +20415,7 @@
           <w:b/>
           <w:bCs/>
         </w:rPr>
+        <w:lastRenderedPageBreak/>
         <w:t>E1 – Ejercicio propio:</w:t>
       </w:r>
       <w:r>
@@ -20351,7 +20479,6 @@
           <w:b/>
           <w:bCs/>
         </w:rPr>
-        <w:lastRenderedPageBreak/>
         <w:t>ER1 – Video no analizable:</w:t>
       </w:r>
       <w:r>
@@ -20845,6 +20972,7 @@
                 <w:b/>
                 <w:bCs/>
               </w:rPr>
+              <w:lastRenderedPageBreak/>
               <w:t>Paso</w:t>
             </w:r>
           </w:p>
@@ -21160,7 +21288,6 @@
                 <w:b/>
                 <w:bCs/>
               </w:rPr>
-              <w:lastRenderedPageBreak/>
               <w:t>5</w:t>
             </w:r>
           </w:p>
@@ -21298,7 +21425,14 @@
         <w:t xml:space="preserve">A1 — </w:t>
       </w:r>
       <w:r>
-        <w:t>Modificar una sesión puntual: el PT accede a una sesión específica generada por el patrón recurrente y la modifica (cambia el horario, la cancela, o la reagenda), indicando que el cambio aplica solo a esa sesión. El sistema ofrece notificar al alumno del cambio (recordatorio de cambio de horario).</w:t>
+        <w:rPr>
+          <w:b/>
+          <w:bCs/>
+        </w:rPr>
+        <w:t>Modificar una sesión puntual</w:t>
+      </w:r>
+      <w:r>
+        <w:t>: el PT accede a una sesión específica generada por el patrón recurrente y la modifica (cambia el horario, la cancela, o la reagenda), indicando que el cambio aplica solo a esa sesión. El sistema ofrece notificar al alumno del cambio (recordatorio de cambio de horario).</w:t>
       </w:r>
     </w:p>
     <w:p>
@@ -21316,7 +21450,14 @@
         <w:t xml:space="preserve">A2 — </w:t>
       </w:r>
       <w:r>
-        <w:t>Editar el patrón recurrente completo: el PT modifica el patrón ya creado (cambia el horario, agrega o quita días, o lo cancela por completo), indicando que el cambio aplica a todo el patrón. El sistema actualiza las sesiones futuras generadas por ese patrón, sin pisar las que ya tengan una excepción puntual aplicada vía A1.</w:t>
+        <w:rPr>
+          <w:b/>
+          <w:bCs/>
+        </w:rPr>
+        <w:t>Editar el patrón recurrente completo</w:t>
+      </w:r>
+      <w:r>
+        <w:t>: el PT modifica el patrón ya creado (cambia el horario, agrega o quita días, o lo cancela por completo), indicando que el cambio aplica a todo el patrón. El sistema actualiza las sesiones futuras generadas por ese patrón, sin pisar las que ya tengan una excepción puntual aplicada vía A1.</w:t>
       </w:r>
     </w:p>
     <w:p>
@@ -21325,16 +21466,56 @@
           <w:ilvl w:val="0"/>
           <w:numId w:val="20"/>
         </w:numPr>
-      </w:pPr>
-      <w:r>
         <w:rPr>
           <w:b/>
           <w:bCs/>
         </w:rPr>
-        <w:t>A3 – Agendar un examen:</w:t>
-      </w:r>
-      <w:r>
-        <w:t xml:space="preserve"> el PT selecciona un alumno y agenda un examen indicando el tipo (evaluación física o examen médico), la fecha y la hora. El sistema lo agrega al calendario como un evento distinto de las sesiones de entrenamiento, y la ficha del alumno (CU10) lo avisa el día que corresponde.</w:t>
+      </w:pPr>
+      <w:r>
+        <w:rPr>
+          <w:b/>
+          <w:bCs/>
+        </w:rPr>
+        <w:t xml:space="preserve">A3 – </w:t>
+      </w:r>
+      <w:r>
+        <w:rPr>
+          <w:b/>
+          <w:bCs/>
+        </w:rPr>
+        <w:t xml:space="preserve">Agendar una evaluación física: </w:t>
+      </w:r>
+      <w:r>
+        <w:t>el PT selecciona un alumno y agenda una evaluación física indicando la fecha y la hora. El sistema la agrega al calendario como un evento distinto de las sesiones de entrenamiento; la ficha del alumno (CU10) la avisa el día que corresponde y aparece en sus próximas sesiones (CU20).</w:t>
+      </w:r>
+    </w:p>
+    <w:p>
+      <w:pPr>
+        <w:numPr>
+          <w:ilvl w:val="0"/>
+          <w:numId w:val="20"/>
+        </w:numPr>
+        <w:rPr>
+          <w:b/>
+          <w:bCs/>
+        </w:rPr>
+      </w:pPr>
+      <w:r>
+        <w:rPr>
+          <w:b/>
+          <w:bCs/>
+        </w:rPr>
+        <w:t>A4 – Agregar nota a la agenda</w:t>
+      </w:r>
+      <w:r>
+        <w:rPr>
+          <w:b/>
+          <w:bCs/>
+        </w:rPr>
+        <w:t xml:space="preserve">: </w:t>
+      </w:r>
+      <w:r>
+        <w:t>El sistema debe permitir al PT agregar notas de texto libre a su agenda, asociadas a una fecha o rango de fechas y opcionalmente a un alumno (por ejemplo, vacaciones, una cancelación del alumno o un examen médico). Las notas solo las ve el PT; las asociadas a un alumno también se muestran en su ficha (CU10).</w:t>
       </w:r>
     </w:p>
     <w:p>
@@ -21364,10 +21545,17 @@
           <w:b/>
           <w:bCs/>
         </w:rPr>
-        <w:t xml:space="preserve">E1 — </w:t>
-      </w:r>
-      <w:r>
-        <w:t>Conflicto de horario: el horario elegido para el patrón o para una sesión puntual se superpone con otra sesión ya agendada del PT. El sistema advierte el conflicto y pide elegir otro horario antes de confirmar.</w:t>
+        <w:t xml:space="preserve">E1 </w:t>
+      </w:r>
+      <w:r>
+        <w:rPr>
+          <w:b/>
+          <w:bCs/>
+        </w:rPr>
+        <w:t>— Conflicto de horario:</w:t>
+      </w:r>
+      <w:r>
+        <w:t xml:space="preserve"> el horario elegido para el patrón o para una sesión puntual se superpone con otra sesión ya agendada del PT. El sistema advierte el conflicto y pide elegir otro horario antes de confirmar.</w:t>
       </w:r>
     </w:p>
     <w:p>
@@ -21385,7 +21573,24 @@
         <w:t xml:space="preserve">E2 — </w:t>
       </w:r>
       <w:r>
-        <w:t>Alumno sin vínculo vigente: el alumno seleccionado no pertenece (o dejó de pertenecer, ver CU</w:t>
+        <w:rPr>
+          <w:b/>
+          <w:bCs/>
+        </w:rPr>
+        <w:t>Alumno sin vínculo</w:t>
+      </w:r>
+      <w:r>
+        <w:t xml:space="preserve"> </w:t>
+      </w:r>
+      <w:r>
+        <w:rPr>
+          <w:b/>
+          <w:bCs/>
+        </w:rPr>
+        <w:t>vigente</w:t>
+      </w:r>
+      <w:r>
+        <w:t>: el alumno seleccionado no pertenece (o dejó de pertenecer, ver CU</w:t>
       </w:r>
       <w:r>
         <w:t>9</w:t>
@@ -21409,7 +21614,17 @@
         <w:t>E3</w:t>
       </w:r>
       <w:r>
-        <w:t xml:space="preserve"> – Sesión registrada sin agenda ese día: el sistema registra la sesión igual y no modifica ninguna asistencia</w:t>
+        <w:t xml:space="preserve"> – </w:t>
+      </w:r>
+      <w:r>
+        <w:rPr>
+          <w:b/>
+          <w:bCs/>
+        </w:rPr>
+        <w:t>Sesión registrada sin agenda ese día</w:t>
+      </w:r>
+      <w:r>
+        <w:t>: el sistema registra la sesión igual y no modifica ninguna asistencia</w:t>
       </w:r>
     </w:p>
     <w:p>
@@ -21447,7 +21662,14 @@
         <w:t xml:space="preserve">ER1 — </w:t>
       </w:r>
       <w:r>
-        <w:t>Falla al generar las sesiones del patrón: error técnico al crear las sesiones futuras; el sistema informa y no persiste cambios parciales.</w:t>
+        <w:rPr>
+          <w:b/>
+          <w:bCs/>
+        </w:rPr>
+        <w:t>Falla al generar las sesiones del patrón</w:t>
+      </w:r>
+      <w:r>
+        <w:t>: error técnico al crear las sesiones futuras; el sistema informa y no persiste cambios parciales.</w:t>
       </w:r>
     </w:p>
     <w:p>
@@ -21465,7 +21687,14 @@
         <w:t xml:space="preserve">ER2 — </w:t>
       </w:r>
       <w:r>
-        <w:t>Falla al enviar la notificación de cambio: la modificación de la sesión se guarda igual, pero el aviso al alumno no llega.</w:t>
+        <w:rPr>
+          <w:b/>
+          <w:bCs/>
+        </w:rPr>
+        <w:t>Falla al enviar la notificación de cambio</w:t>
+      </w:r>
+      <w:r>
+        <w:t>: la modificación de la sesión se guarda igual, pero el aviso al alumno no llega.</w:t>
       </w:r>
     </w:p>
     <w:p/>
@@ -21474,6 +21703,7 @@
         <w:rPr>
           <w:noProof/>
         </w:rPr>
+        <w:lastRenderedPageBreak/>
         <w:drawing>
           <wp:inline distT="0" distB="0" distL="0" distR="0" wp14:anchorId="333583A9" wp14:editId="2708B7A6">
             <wp:extent cx="4412825" cy="2775005"/>
@@ -21549,8 +21779,8 @@
         <w:tblLook w:val="04A0" w:firstRow="1" w:lastRow="0" w:firstColumn="1" w:lastColumn="0" w:noHBand="0" w:noVBand="1"/>
       </w:tblPr>
       <w:tblGrid>
-        <w:gridCol w:w="1865"/>
-        <w:gridCol w:w="7161"/>
+        <w:gridCol w:w="1873"/>
+        <w:gridCol w:w="7153"/>
       </w:tblGrid>
       <w:tr>
         <w:trPr>
@@ -21663,7 +21893,6 @@
                 <w:b/>
                 <w:bCs/>
               </w:rPr>
-              <w:lastRenderedPageBreak/>
               <w:t>Trigger</w:t>
             </w:r>
           </w:p>
@@ -21793,7 +22022,22 @@
           </w:tcPr>
           <w:p>
             <w:r>
-              <w:t>Las sesiones y exámenes del usuario se reflejan en su calendario externo y se mantienen actualizados cuando cambian en la app</w:t>
+              <w:t xml:space="preserve">Las </w:t>
+            </w:r>
+            <w:r>
+              <w:t>sesiones y evaluaciones físicas</w:t>
+            </w:r>
+            <w:r>
+              <w:t xml:space="preserve"> </w:t>
+            </w:r>
+            <w:r>
+              <w:t>se reflejan</w:t>
+            </w:r>
+            <w:r>
+              <w:t xml:space="preserve"> </w:t>
+            </w:r>
+            <w:r>
+              <w:t>en su calendario externo y se mantienen actualizados cuando cambian en la app</w:t>
             </w:r>
           </w:p>
         </w:tc>
@@ -22276,7 +22520,16 @@
           </w:tcPr>
           <w:p>
             <w:r>
-              <w:t>Confirma la vinculación y envía al calendario externo las sesiones y exámenes próximos del usuario</w:t>
+              <w:t xml:space="preserve">Confirma la vinculación y </w:t>
+            </w:r>
+            <w:r>
+              <w:t xml:space="preserve">envía al calendario externo las </w:t>
+            </w:r>
+            <w:r>
+              <w:t>sesiones y evaluaciones físicas</w:t>
+            </w:r>
+            <w:r>
+              <w:t xml:space="preserve"> próximos del usuario </w:t>
             </w:r>
           </w:p>
         </w:tc>
@@ -22327,7 +22580,16 @@
           </w:tcPr>
           <w:p>
             <w:r>
-              <w:t>Mantiene la sincronización: cuando una sesión o examen se agenda, cambia o cancela, el cambio se refleja en el calendario externo</w:t>
+              <w:t xml:space="preserve">Mantiene la sincronización: cuando una </w:t>
+            </w:r>
+            <w:r>
+              <w:t>sesión o evaluación física</w:t>
+            </w:r>
+            <w:r>
+              <w:t xml:space="preserve"> </w:t>
+            </w:r>
+            <w:r>
+              <w:t>se agenda, cambia o cancela, el cambio se refleja en el calendario externo</w:t>
             </w:r>
           </w:p>
         </w:tc>
@@ -22408,6 +22670,7 @@
           <w:b/>
           <w:bCs/>
         </w:rPr>
+        <w:lastRenderedPageBreak/>
         <w:t>ER1 — El servicio de calendario externo no está disponible:</w:t>
       </w:r>
       <w:r>
@@ -22441,7 +22704,34 @@
         <w:t>Nota técnica:</w:t>
       </w:r>
       <w:r>
-        <w:t xml:space="preserve"> el sistema no implementa un calendario propio: se integra con un servicio de calendario externo, que es quien administra el calendario del usuario, igual que en el pago online y en la autenticación. La app solo le envía las sesiones y exámenes de su agenda (CU18). La sincronización es de un solo sentido: lo que cambia en la app se refleja en el calendario externo, y no al revés. El servicio concreto y la forma de integrarlo se definen en la etapa de diseño.</w:t>
+        <w:t xml:space="preserve"> el sistema no implementa un calendario propio: se integra con un servicio de calendario externo, que es quien administra el calendario del usuario, igual que en el pago online y en la autenticación.</w:t>
+      </w:r>
+      <w:r>
+        <w:t xml:space="preserve"> </w:t>
+      </w:r>
+      <w:r>
+        <w:t xml:space="preserve">La app solo le envía las </w:t>
+      </w:r>
+      <w:r>
+        <w:t>s</w:t>
+      </w:r>
+      <w:r>
+        <w:t>esiones y evaluaciones físicas</w:t>
+      </w:r>
+      <w:r>
+        <w:t xml:space="preserve"> </w:t>
+      </w:r>
+      <w:r>
+        <w:t xml:space="preserve">de su agenda </w:t>
+      </w:r>
+      <w:r>
+        <w:t>(PT: CU18; Alumno: CU20)</w:t>
+      </w:r>
+      <w:r>
+        <w:t>.</w:t>
+      </w:r>
+      <w:r>
+        <w:t>. La sincronización es de un solo sentido: lo que cambia en la app se refleja en el calendario externo, y no al revés. El servicio concreto y la forma de integrarlo se definen en la etapa de diseño.</w:t>
       </w:r>
     </w:p>
     <w:p/>
@@ -22730,7 +23020,6 @@
                 <w:b/>
                 <w:bCs/>
               </w:rPr>
-              <w:lastRenderedPageBreak/>
               <w:t>Postcondición de éxito</w:t>
             </w:r>
           </w:p>
@@ -22746,7 +23035,13 @@
               <w:ind w:left="720"/>
             </w:pPr>
             <w:r>
-              <w:t>Se muestra la lista de los próximos 3 a 5 eventos del alumno (sesiones de entrenamiento y exámenes), ordenados por fecha</w:t>
+              <w:t xml:space="preserve">Se muestra la lista de los próximos 3 a 5 eventos del alumno </w:t>
+            </w:r>
+            <w:r>
+              <w:t>(sesiones de entrenamiento y evaluaciones físicas)</w:t>
+            </w:r>
+            <w:r>
+              <w:t>, ordenados por fecha</w:t>
             </w:r>
           </w:p>
         </w:tc>
@@ -23054,7 +23349,13 @@
               <w:ind w:left="720"/>
             </w:pPr>
             <w:r>
-              <w:t>Obtiene los próximos 3 a 5 eventos agendados por su/s PT (sesiones y exámenes), ordenados por fecha</w:t>
+              <w:t xml:space="preserve">Obtiene los próximos 3 a 5 eventos agendados por su/s PT </w:t>
+            </w:r>
+            <w:r>
+              <w:t>(sesiones y evaluaciones físicas)</w:t>
+            </w:r>
+            <w:r>
+              <w:t>, ordenados por fecha</w:t>
             </w:r>
           </w:p>
         </w:tc>
@@ -23104,7 +23405,22 @@
               <w:ind w:left="720"/>
             </w:pPr>
             <w:r>
-              <w:t>Muestra fecha, hora y PT de cada sesión o examen, indicando el tipo (sesión de entrenamiento, evaluación física o examen médico)</w:t>
+              <w:t xml:space="preserve">Muestra fecha, hora y PT de cada </w:t>
+            </w:r>
+            <w:r>
+              <w:t>sesión o evaluación física</w:t>
+            </w:r>
+            <w:r>
+              <w:t>, indicando el tipo (sesión de entrenamiento</w:t>
+            </w:r>
+            <w:r>
+              <w:t xml:space="preserve"> o</w:t>
+            </w:r>
+            <w:r>
+              <w:t xml:space="preserve"> evaluación física</w:t>
+            </w:r>
+            <w:r>
+              <w:t>)</w:t>
             </w:r>
           </w:p>
         </w:tc>
@@ -23688,7 +24004,7 @@
         <w:t>Flujo Principal</w:t>
       </w:r>
       <w:r>
-        <w:t xml:space="preserve"> (camino manual)</w:t>
+        <w:t xml:space="preserve"> </w:t>
       </w:r>
     </w:p>
     <w:p>
@@ -24236,7 +24552,13 @@
         <w:t xml:space="preserve"> - Pago online del alumno</w:t>
       </w:r>
       <w:r>
-        <w:t>: si el alumno paga por la pasarela (CU22), el pago queda registrado automáticamente como pagado y el flujo continúa en el paso 3.</w:t>
+        <w:t xml:space="preserve">: si el alumno paga por la pasarela (CU22), el pago queda registrado automáticamente como pagado y el flujo continúa en el paso </w:t>
+      </w:r>
+      <w:r>
+        <w:t>4 y 5</w:t>
+      </w:r>
+      <w:r>
+        <w:t>.</w:t>
       </w:r>
     </w:p>
     <w:p>
@@ -24275,24 +24597,6 @@
       </w:r>
       <w:r>
         <w:t>.</w:t>
-      </w:r>
-    </w:p>
-    <w:p>
-      <w:pPr>
-        <w:numPr>
-          <w:ilvl w:val="0"/>
-          <w:numId w:val="25"/>
-        </w:numPr>
-      </w:pPr>
-      <w:r>
-        <w:rPr>
-          <w:b/>
-          <w:bCs/>
-        </w:rPr>
-        <w:t>A4</w:t>
-      </w:r>
-      <w:r>
-        <w:t xml:space="preserve"> – Conectar cuenta de cobro</w:t>
       </w:r>
     </w:p>
     <w:p>
@@ -24491,6 +24795,7 @@
       </w:pPr>
       <w:bookmarkStart w:id="27" w:name="_Toc242824262"/>
       <w:r>
+        <w:lastRenderedPageBreak/>
         <w:t>CU2</w:t>
       </w:r>
       <w:r>
@@ -24514,8 +24819,8 @@
         <w:tblLook w:val="04A0" w:firstRow="1" w:lastRow="0" w:firstColumn="1" w:lastColumn="0" w:noHBand="0" w:noVBand="1"/>
       </w:tblPr>
       <w:tblGrid>
-        <w:gridCol w:w="1621"/>
-        <w:gridCol w:w="7405"/>
+        <w:gridCol w:w="1635"/>
+        <w:gridCol w:w="7391"/>
       </w:tblGrid>
       <w:tr>
         <w:trPr>
@@ -24601,7 +24906,7 @@
           </w:tcPr>
           <w:p>
             <w:r>
-              <w:t>Alumno</w:t>
+              <w:t>Alumno (PT en A1)</w:t>
             </w:r>
           </w:p>
         </w:tc>
@@ -24718,7 +25023,10 @@
           </w:tcPr>
           <w:p>
             <w:r>
-              <w:t>Alumno con sesión iniciada (CU1), vinculado a la Organización (CU5, CU6 o CU7), con una cuota definida por su PT (CU21) y con la Organización con su cuenta de cobro conectada a la pasarela (CU21, A4)</w:t>
+              <w:t xml:space="preserve">Alumno con sesión iniciada (CU1), vinculado a la Organización (CU5, CU6 o CU7), con una cuota definida por su PT (CU21) y con la Organización con su </w:t>
+            </w:r>
+            <w:r>
+              <w:t>cuenta de cobro conectada a la pasarela (A1)</w:t>
             </w:r>
           </w:p>
         </w:tc>
@@ -25327,6 +25635,56 @@
           <w:bCs/>
         </w:rPr>
       </w:pPr>
+    </w:p>
+    <w:p>
+      <w:pPr>
+        <w:rPr>
+          <w:b/>
+          <w:bCs/>
+        </w:rPr>
+      </w:pPr>
+      <w:r>
+        <w:rPr>
+          <w:b/>
+          <w:bCs/>
+        </w:rPr>
+        <w:t>Flujos alternativos</w:t>
+      </w:r>
+    </w:p>
+    <w:p>
+      <w:pPr>
+        <w:rPr>
+          <w:b/>
+          <w:bCs/>
+        </w:rPr>
+      </w:pPr>
+    </w:p>
+    <w:p>
+      <w:pPr>
+        <w:pStyle w:val="Prrafodelista"/>
+        <w:numPr>
+          <w:ilvl w:val="0"/>
+          <w:numId w:val="70"/>
+        </w:numPr>
+      </w:pPr>
+      <w:r>
+        <w:rPr>
+          <w:b/>
+          <w:bCs/>
+        </w:rPr>
+        <w:t xml:space="preserve">A1 – </w:t>
+      </w:r>
+      <w:r>
+        <w:t>Conectar cuenta de cobro (actor: PT): el PT accede a “Cuenta de cobro” desde su perfil y elige conectar. El sistema lo deriva a la pasarela de pago para que autorice la vinculación de la cuenta de su Organización. Al volver, el sistema confirma la conexión y habilita “Pagar online” para sus alumnos. El PT puede desconectarla; en ese caso la opción deja de estar disponible.</w:t>
+      </w:r>
+    </w:p>
+    <w:p>
+      <w:pPr>
+        <w:rPr>
+          <w:b/>
+          <w:bCs/>
+        </w:rPr>
+      </w:pPr>
       <w:r>
         <w:rPr>
           <w:b/>
@@ -25387,7 +25745,13 @@
         <w:t>E3 – Organización sin cuenta de cobro conectada:</w:t>
       </w:r>
       <w:r>
-        <w:t xml:space="preserve"> la opción “Pagar online” no está disponible y el sistema informa que el pago se coordina con el PT (la cuenta de cobro se conecta en CU21, A4).</w:t>
+        <w:t xml:space="preserve"> la opción “Pagar online” no está disponible y el sistema informa que el pago se coordina con el PT (</w:t>
+      </w:r>
+      <w:r>
+        <w:t>la cuenta de cobro se conecta en A1</w:t>
+      </w:r>
+      <w:r>
+        <w:t>).</w:t>
       </w:r>
     </w:p>
     <w:p>
@@ -27871,8 +28235,8 @@
       </w:tblPr>
       <w:tblGrid>
         <w:gridCol w:w="1195"/>
-        <w:gridCol w:w="1638"/>
-        <w:gridCol w:w="6193"/>
+        <w:gridCol w:w="1633"/>
+        <w:gridCol w:w="6198"/>
       </w:tblGrid>
       <w:tr>
         <w:trPr>
@@ -27994,7 +28358,13 @@
               <w:ind w:left="720"/>
             </w:pPr>
             <w:r>
-              <w:t>Accede a “Progresión biométrica” (el PT desde la ficha del alumno, CU10; el alumno desde su Home, CU29)</w:t>
+              <w:t xml:space="preserve">Accede a “Progresión biométrica” (el PT desde la ficha del alumno, CU10; </w:t>
+            </w:r>
+            <w:r>
+              <w:t>el alumno desde la sección ‘Historial’ de su Home, CU29</w:t>
+            </w:r>
+            <w:r>
+              <w:t>)</w:t>
             </w:r>
           </w:p>
         </w:tc>
@@ -28654,8 +29024,8 @@
       </w:tblPr>
       <w:tblGrid>
         <w:gridCol w:w="1195"/>
-        <w:gridCol w:w="1568"/>
-        <w:gridCol w:w="6263"/>
+        <w:gridCol w:w="1567"/>
+        <w:gridCol w:w="6264"/>
       </w:tblGrid>
       <w:tr>
         <w:trPr>
@@ -28777,10 +29147,7 @@
               <w:ind w:left="720"/>
             </w:pPr>
             <w:r>
-              <w:t xml:space="preserve">Accede a un ejercicio puntual </w:t>
-            </w:r>
-            <w:r>
-              <w:t>(desde el resumen de sesión, CU16, o desde la ficha del alumno, CU10)</w:t>
+              <w:t>Accede a la progresión de ejercicios (el PT desde la ficha del alumno, CU10; el alumno desde la sección ‘Historial’ de su Home, CU29)</w:t>
             </w:r>
           </w:p>
         </w:tc>
@@ -28838,6 +29205,12 @@
             <w:r>
               <w:t>y agrupa los registros de peso levantado de esa familia</w:t>
             </w:r>
+            <w:r>
+              <w:t xml:space="preserve"> </w:t>
+            </w:r>
+            <w:r>
+              <w:t>o por grupo muscular (categoría del ejercicio)</w:t>
+            </w:r>
           </w:p>
         </w:tc>
       </w:tr>
@@ -28887,6 +29260,17 @@
             </w:pPr>
             <w:r>
               <w:t>Muestra la curva de progresión (peso de las series completadas en el tiempo) para ese ejercicio. Si el PT corrigió el peso de una serie, se muestra el peso corregido; si no, el programado en la rutina</w:t>
+            </w:r>
+            <w:r>
+              <w:t>.</w:t>
+            </w:r>
+          </w:p>
+          <w:p>
+            <w:pPr>
+              <w:ind w:left="720"/>
+            </w:pPr>
+            <w:r>
+              <w:t>Destaca el récord personal (PR) del ejercicio: el mayor peso registrado en una serie completada</w:t>
             </w:r>
           </w:p>
         </w:tc>
@@ -29133,7 +29517,6 @@
                 <w:b/>
                 <w:bCs/>
               </w:rPr>
-              <w:lastRenderedPageBreak/>
               <w:t>Campo</w:t>
             </w:r>
           </w:p>
@@ -29639,7 +30022,7 @@
               <w:ind w:left="720"/>
             </w:pPr>
             <w:r>
-              <w:t>Accede a “Exportar mis datos” desde su Home (CU29)</w:t>
+              <w:t>Accede a ‘Exportar mis datos’ desde la sección ‘Historial’ de su Home (CU29)</w:t>
             </w:r>
           </w:p>
         </w:tc>
@@ -29697,7 +30080,13 @@
               <w:ind w:left="720"/>
             </w:pPr>
             <w:r>
-              <w:t>Selecciona qué exportar: datos biométricos y medidas corporales, historial médico, progresión de ejercicios, y/o historial de asistencia</w:t>
+              <w:t xml:space="preserve">Selecciona qué exportar: datos biométricos y medidas corporales, historial médico, </w:t>
+            </w:r>
+            <w:r>
+              <w:t>historial de ejercicios con sus récords personales (PR)</w:t>
+            </w:r>
+            <w:r>
+              <w:t>, y/o historial de asistencia</w:t>
             </w:r>
           </w:p>
         </w:tc>
@@ -30672,7 +31061,7 @@
           </w:tcPr>
           <w:p>
             <w:r>
-              <w:t>Muestra los recordatorios del día: vencimiento de pagos (CU21), agenda (CU18) y exámenes (CU18), según lo configurado en CU30</w:t>
+              <w:t>Muestra los recordatorios del día: vencimiento de pagos (CU21), agenda (CU18), evaluaciones físicas y notas del día (CU18), según lo configurado en CU30</w:t>
             </w:r>
           </w:p>
         </w:tc>
@@ -31637,7 +32026,16 @@
               <w:ind w:left="720"/>
             </w:pPr>
             <w:r>
-              <w:t>Muestra su próxima sesión o examen agendado (CU20)</w:t>
+              <w:t xml:space="preserve">Muestra su próxima sesión o </w:t>
+            </w:r>
+            <w:r>
+              <w:t>evaluación física agendada</w:t>
+            </w:r>
+            <w:r>
+              <w:t xml:space="preserve"> </w:t>
+            </w:r>
+            <w:r>
+              <w:t>(CU20)</w:t>
             </w:r>
           </w:p>
         </w:tc>
@@ -31807,38 +32205,62 @@
               <w:ind w:left="720"/>
             </w:pPr>
             <w:r>
+              <w:t>6</w:t>
+            </w:r>
+          </w:p>
+        </w:tc>
+        <w:tc>
+          <w:tcPr>
+            <w:tcW w:w="0" w:type="auto"/>
+            <w:vAlign w:val="center"/>
+            <w:hideMark/>
+          </w:tcPr>
+          <w:p>
+            <w:pPr>
+              <w:ind w:left="720"/>
+            </w:pPr>
+            <w:r>
+              <w:t>Alumno</w:t>
+            </w:r>
+          </w:p>
+        </w:tc>
+        <w:tc>
+          <w:tcPr>
+            <w:tcW w:w="0" w:type="auto"/>
+            <w:vAlign w:val="center"/>
+            <w:hideMark/>
+          </w:tcPr>
+          <w:p>
+            <w:pPr>
+              <w:ind w:left="720"/>
+            </w:pPr>
+            <w:r>
+              <w:t xml:space="preserve">Alumno: Accede a sus secciones desde el Home: historial médico (CU11), datos biométricos y progresión (CU23 a CU26), exportar </w:t>
+            </w:r>
+            <w:r>
               <w:lastRenderedPageBreak/>
-              <w:t>6</w:t>
-            </w:r>
-          </w:p>
-        </w:tc>
-        <w:tc>
-          <w:tcPr>
-            <w:tcW w:w="0" w:type="auto"/>
-            <w:vAlign w:val="center"/>
-            <w:hideMark/>
-          </w:tcPr>
-          <w:p>
-            <w:pPr>
-              <w:ind w:left="720"/>
-            </w:pPr>
-            <w:r>
-              <w:t>Alumno</w:t>
-            </w:r>
-          </w:p>
-        </w:tc>
-        <w:tc>
-          <w:tcPr>
-            <w:tcW w:w="0" w:type="auto"/>
-            <w:vAlign w:val="center"/>
-            <w:hideMark/>
-          </w:tcPr>
-          <w:p>
-            <w:pPr>
-              <w:ind w:left="720"/>
-            </w:pPr>
-            <w:r>
-              <w:t>Alumno: Accede a sus secciones desde el Home: historial médico (CU11), datos biométricos y progresión (CU23 a CU26), exportar datos (CU27) y configurar Home (CU30)</w:t>
+              <w:t>datos (CU27)</w:t>
+            </w:r>
+            <w:r>
+              <w:t>,</w:t>
+            </w:r>
+            <w:r>
+              <w:t xml:space="preserve"> </w:t>
+            </w:r>
+            <w:r>
+              <w:t>próximas sesiones (CU20)</w:t>
+            </w:r>
+            <w:r>
+              <w:t xml:space="preserve">, </w:t>
+            </w:r>
+            <w:r>
+              <w:t>configurar Home (CU30)</w:t>
+            </w:r>
+            <w:r>
+              <w:t xml:space="preserve"> y </w:t>
+            </w:r>
+            <w:r>
+              <w:t xml:space="preserve"> la sección “Historial” con el historial de ejercicios</w:t>
             </w:r>
           </w:p>
         </w:tc>
@@ -32336,50 +32758,50 @@
                 <w:b/>
                 <w:bCs/>
               </w:rPr>
+              <w:t>Postcondición de éxito</w:t>
+            </w:r>
+          </w:p>
+        </w:tc>
+        <w:tc>
+          <w:tcPr>
+            <w:tcW w:w="0" w:type="auto"/>
+            <w:vAlign w:val="center"/>
+            <w:hideMark/>
+          </w:tcPr>
+          <w:p>
+            <w:pPr>
+              <w:ind w:left="720"/>
+            </w:pPr>
+            <w:r>
+              <w:t>La configuración del Home queda guardada y se aplica en los siguientes ingresos del usuario</w:t>
+            </w:r>
+          </w:p>
+        </w:tc>
+      </w:tr>
+      <w:tr>
+        <w:trPr>
+          <w:tblCellSpacing w:w="15" w:type="dxa"/>
+        </w:trPr>
+        <w:tc>
+          <w:tcPr>
+            <w:tcW w:w="0" w:type="auto"/>
+            <w:vAlign w:val="center"/>
+            <w:hideMark/>
+          </w:tcPr>
+          <w:p>
+            <w:pPr>
+              <w:ind w:left="720"/>
+              <w:rPr>
+                <w:b/>
+                <w:bCs/>
+              </w:rPr>
+            </w:pPr>
+            <w:r>
+              <w:rPr>
+                <w:b/>
+                <w:bCs/>
+              </w:rPr>
               <w:lastRenderedPageBreak/>
-              <w:t>Postcondición de éxito</w:t>
-            </w:r>
-          </w:p>
-        </w:tc>
-        <w:tc>
-          <w:tcPr>
-            <w:tcW w:w="0" w:type="auto"/>
-            <w:vAlign w:val="center"/>
-            <w:hideMark/>
-          </w:tcPr>
-          <w:p>
-            <w:pPr>
-              <w:ind w:left="720"/>
-            </w:pPr>
-            <w:r>
-              <w:t>La configuración del Home queda guardada y se aplica en los siguientes ingresos del usuario</w:t>
-            </w:r>
-          </w:p>
-        </w:tc>
-      </w:tr>
-      <w:tr>
-        <w:trPr>
-          <w:tblCellSpacing w:w="15" w:type="dxa"/>
-        </w:trPr>
-        <w:tc>
-          <w:tcPr>
-            <w:tcW w:w="0" w:type="auto"/>
-            <w:vAlign w:val="center"/>
-            <w:hideMark/>
-          </w:tcPr>
-          <w:p>
-            <w:pPr>
-              <w:ind w:left="720"/>
-              <w:rPr>
-                <w:b/>
-                <w:bCs/>
-              </w:rPr>
-            </w:pPr>
-            <w:r>
-              <w:rPr>
-                <w:b/>
-                <w:bCs/>
-              </w:rPr>
               <w:t>Postcondición de fracaso</w:t>
             </w:r>
           </w:p>
@@ -32677,7 +33099,7 @@
               <w:ind w:left="720"/>
             </w:pPr>
             <w:r>
-              <w:t>Muestra los bloques disponibles para su rol, con su orden y visibilidad actuales (PT: recordatorios, agenda del día y cuotas vencidas; Alumno: próxima sesión o examen, rutina de hoy, peso y variación, y aviso de cuota vencida)</w:t>
+              <w:t>Muestra los bloques disponibles para su rol, con su orden y visibilidad actuales (PT: recordatorios, agenda del día y cuotas vencidas; Alumno: próxima sesión o evaluación física, rutina de hoy, peso y variación, y aviso de cuota vencida)</w:t>
             </w:r>
           </w:p>
         </w:tc>
@@ -32836,25 +33258,22 @@
               <w:ind w:left="720"/>
             </w:pPr>
             <w:r>
-              <w:t>Usuario</w:t>
-            </w:r>
-          </w:p>
-        </w:tc>
-        <w:tc>
-          <w:tcPr>
-            <w:tcW w:w="0" w:type="auto"/>
-            <w:vAlign w:val="center"/>
-            <w:hideMark/>
-          </w:tcPr>
-          <w:p>
-            <w:pPr>
-              <w:ind w:left="720"/>
-            </w:pPr>
-            <w:r>
-              <w:t xml:space="preserve">Elige qué tipos de recordatorio quiere recibir </w:t>
-            </w:r>
-            <w:r>
-              <w:t>(vencimiento de pagos, agenda, examen), según su rol</w:t>
+              <w:t>PT</w:t>
+            </w:r>
+          </w:p>
+        </w:tc>
+        <w:tc>
+          <w:tcPr>
+            <w:tcW w:w="0" w:type="auto"/>
+            <w:vAlign w:val="center"/>
+            <w:hideMark/>
+          </w:tcPr>
+          <w:p>
+            <w:pPr>
+              <w:ind w:left="720"/>
+            </w:pPr>
+            <w:r>
+              <w:t>Elige qué tipos de recordatorio quiere recibir (vencimiento de pagos, agenda, evaluaciones físicas y notas del día)</w:t>
             </w:r>
           </w:p>
         </w:tc>
@@ -40976,6 +41395,119 @@
     </w:lvl>
   </w:abstractNum>
   <w:abstractNum w:abstractNumId="52" w15:restartNumberingAfterBreak="0">
+    <w:nsid w:val="52BC2FAD"/>
+    <w:multiLevelType w:val="hybridMultilevel"/>
+    <w:tmpl w:val="62EC51E6"/>
+    <w:lvl w:ilvl="0" w:tplc="380A0001">
+      <w:start w:val="1"/>
+      <w:numFmt w:val="bullet"/>
+      <w:lvlText w:val=""/>
+      <w:lvlJc w:val="left"/>
+      <w:pPr>
+        <w:ind w:left="720" w:hanging="360"/>
+      </w:pPr>
+      <w:rPr>
+        <w:rFonts w:ascii="Symbol" w:hAnsi="Symbol" w:hint="default"/>
+      </w:rPr>
+    </w:lvl>
+    <w:lvl w:ilvl="1" w:tplc="380A0003" w:tentative="1">
+      <w:start w:val="1"/>
+      <w:numFmt w:val="bullet"/>
+      <w:lvlText w:val="o"/>
+      <w:lvlJc w:val="left"/>
+      <w:pPr>
+        <w:ind w:left="1440" w:hanging="360"/>
+      </w:pPr>
+      <w:rPr>
+        <w:rFonts w:ascii="Courier New" w:hAnsi="Courier New" w:cs="Courier New" w:hint="default"/>
+      </w:rPr>
+    </w:lvl>
+    <w:lvl w:ilvl="2" w:tplc="380A0005" w:tentative="1">
+      <w:start w:val="1"/>
+      <w:numFmt w:val="bullet"/>
+      <w:lvlText w:val=""/>
+      <w:lvlJc w:val="left"/>
+      <w:pPr>
+        <w:ind w:left="2160" w:hanging="360"/>
+      </w:pPr>
+      <w:rPr>
+        <w:rFonts w:ascii="Wingdings" w:hAnsi="Wingdings" w:hint="default"/>
+      </w:rPr>
+    </w:lvl>
+    <w:lvl w:ilvl="3" w:tplc="380A0001" w:tentative="1">
+      <w:start w:val="1"/>
+      <w:numFmt w:val="bullet"/>
+      <w:lvlText w:val=""/>
+      <w:lvlJc w:val="left"/>
+      <w:pPr>
+        <w:ind w:left="2880" w:hanging="360"/>
+      </w:pPr>
+      <w:rPr>
+        <w:rFonts w:ascii="Symbol" w:hAnsi="Symbol" w:hint="default"/>
+      </w:rPr>
+    </w:lvl>
+    <w:lvl w:ilvl="4" w:tplc="380A0003" w:tentative="1">
+      <w:start w:val="1"/>
+      <w:numFmt w:val="bullet"/>
+      <w:lvlText w:val="o"/>
+      <w:lvlJc w:val="left"/>
+      <w:pPr>
+        <w:ind w:left="3600" w:hanging="360"/>
+      </w:pPr>
+      <w:rPr>
+        <w:rFonts w:ascii="Courier New" w:hAnsi="Courier New" w:cs="Courier New" w:hint="default"/>
+      </w:rPr>
+    </w:lvl>
+    <w:lvl w:ilvl="5" w:tplc="380A0005" w:tentative="1">
+      <w:start w:val="1"/>
+      <w:numFmt w:val="bullet"/>
+      <w:lvlText w:val=""/>
+      <w:lvlJc w:val="left"/>
+      <w:pPr>
+        <w:ind w:left="4320" w:hanging="360"/>
+      </w:pPr>
+      <w:rPr>
+        <w:rFonts w:ascii="Wingdings" w:hAnsi="Wingdings" w:hint="default"/>
+      </w:rPr>
+    </w:lvl>
+    <w:lvl w:ilvl="6" w:tplc="380A0001" w:tentative="1">
+      <w:start w:val="1"/>
+      <w:numFmt w:val="bullet"/>
+      <w:lvlText w:val=""/>
+      <w:lvlJc w:val="left"/>
+      <w:pPr>
+        <w:ind w:left="5040" w:hanging="360"/>
+      </w:pPr>
+      <w:rPr>
+        <w:rFonts w:ascii="Symbol" w:hAnsi="Symbol" w:hint="default"/>
+      </w:rPr>
+    </w:lvl>
+    <w:lvl w:ilvl="7" w:tplc="380A0003" w:tentative="1">
+      <w:start w:val="1"/>
+      <w:numFmt w:val="bullet"/>
+      <w:lvlText w:val="o"/>
+      <w:lvlJc w:val="left"/>
+      <w:pPr>
+        <w:ind w:left="5760" w:hanging="360"/>
+      </w:pPr>
+      <w:rPr>
+        <w:rFonts w:ascii="Courier New" w:hAnsi="Courier New" w:cs="Courier New" w:hint="default"/>
+      </w:rPr>
+    </w:lvl>
+    <w:lvl w:ilvl="8" w:tplc="380A0005" w:tentative="1">
+      <w:start w:val="1"/>
+      <w:numFmt w:val="bullet"/>
+      <w:lvlText w:val=""/>
+      <w:lvlJc w:val="left"/>
+      <w:pPr>
+        <w:ind w:left="6480" w:hanging="360"/>
+      </w:pPr>
+      <w:rPr>
+        <w:rFonts w:ascii="Wingdings" w:hAnsi="Wingdings" w:hint="default"/>
+      </w:rPr>
+    </w:lvl>
+  </w:abstractNum>
+  <w:abstractNum w:abstractNumId="53" w15:restartNumberingAfterBreak="0">
     <w:nsid w:val="53453BCE"/>
     <w:multiLevelType w:val="multilevel"/>
     <w:tmpl w:val="2B2E078A"/>
@@ -41124,7 +41656,7 @@
       </w:rPr>
     </w:lvl>
   </w:abstractNum>
-  <w:abstractNum w:abstractNumId="53" w15:restartNumberingAfterBreak="0">
+  <w:abstractNum w:abstractNumId="54" w15:restartNumberingAfterBreak="0">
     <w:nsid w:val="563D3908"/>
     <w:multiLevelType w:val="hybridMultilevel"/>
     <w:tmpl w:val="B024E9E0"/>
@@ -41237,7 +41769,7 @@
       </w:rPr>
     </w:lvl>
   </w:abstractNum>
-  <w:abstractNum w:abstractNumId="54" w15:restartNumberingAfterBreak="0">
+  <w:abstractNum w:abstractNumId="55" w15:restartNumberingAfterBreak="0">
     <w:nsid w:val="59363951"/>
     <w:multiLevelType w:val="multilevel"/>
     <w:tmpl w:val="515A71CA"/>
@@ -41386,7 +41918,7 @@
       </w:rPr>
     </w:lvl>
   </w:abstractNum>
-  <w:abstractNum w:abstractNumId="55" w15:restartNumberingAfterBreak="0">
+  <w:abstractNum w:abstractNumId="56" w15:restartNumberingAfterBreak="0">
     <w:nsid w:val="5D0F505A"/>
     <w:multiLevelType w:val="multilevel"/>
     <w:tmpl w:val="B33A3A32"/>
@@ -41535,7 +42067,7 @@
       </w:rPr>
     </w:lvl>
   </w:abstractNum>
-  <w:abstractNum w:abstractNumId="56" w15:restartNumberingAfterBreak="0">
+  <w:abstractNum w:abstractNumId="57" w15:restartNumberingAfterBreak="0">
     <w:nsid w:val="5D2C184E"/>
     <w:multiLevelType w:val="multilevel"/>
     <w:tmpl w:val="37F2C014"/>
@@ -41684,7 +42216,7 @@
       </w:rPr>
     </w:lvl>
   </w:abstractNum>
-  <w:abstractNum w:abstractNumId="57" w15:restartNumberingAfterBreak="0">
+  <w:abstractNum w:abstractNumId="58" w15:restartNumberingAfterBreak="0">
     <w:nsid w:val="5E9C43DA"/>
     <w:multiLevelType w:val="multilevel"/>
     <w:tmpl w:val="949CD2CA"/>
@@ -41833,7 +42365,7 @@
       </w:rPr>
     </w:lvl>
   </w:abstractNum>
-  <w:abstractNum w:abstractNumId="58" w15:restartNumberingAfterBreak="0">
+  <w:abstractNum w:abstractNumId="59" w15:restartNumberingAfterBreak="0">
     <w:nsid w:val="61153048"/>
     <w:multiLevelType w:val="multilevel"/>
     <w:tmpl w:val="FD8EDF72"/>
@@ -41982,7 +42514,7 @@
       </w:rPr>
     </w:lvl>
   </w:abstractNum>
-  <w:abstractNum w:abstractNumId="59" w15:restartNumberingAfterBreak="0">
+  <w:abstractNum w:abstractNumId="60" w15:restartNumberingAfterBreak="0">
     <w:nsid w:val="63D3703C"/>
     <w:multiLevelType w:val="multilevel"/>
     <w:tmpl w:val="0100CE42"/>
@@ -42131,7 +42663,7 @@
       </w:rPr>
     </w:lvl>
   </w:abstractNum>
-  <w:abstractNum w:abstractNumId="60" w15:restartNumberingAfterBreak="0">
+  <w:abstractNum w:abstractNumId="61" w15:restartNumberingAfterBreak="0">
     <w:nsid w:val="652517CF"/>
     <w:multiLevelType w:val="multilevel"/>
     <w:tmpl w:val="23B8D300"/>
@@ -42280,7 +42812,7 @@
       </w:rPr>
     </w:lvl>
   </w:abstractNum>
-  <w:abstractNum w:abstractNumId="61" w15:restartNumberingAfterBreak="0">
+  <w:abstractNum w:abstractNumId="62" w15:restartNumberingAfterBreak="0">
     <w:nsid w:val="664E1C86"/>
     <w:multiLevelType w:val="multilevel"/>
     <w:tmpl w:val="01A08E38"/>
@@ -42429,7 +42961,7 @@
       </w:rPr>
     </w:lvl>
   </w:abstractNum>
-  <w:abstractNum w:abstractNumId="62" w15:restartNumberingAfterBreak="0">
+  <w:abstractNum w:abstractNumId="63" w15:restartNumberingAfterBreak="0">
     <w:nsid w:val="6CA12974"/>
     <w:multiLevelType w:val="multilevel"/>
     <w:tmpl w:val="E4007DD0"/>
@@ -42578,7 +43110,7 @@
       </w:rPr>
     </w:lvl>
   </w:abstractNum>
-  <w:abstractNum w:abstractNumId="63" w15:restartNumberingAfterBreak="0">
+  <w:abstractNum w:abstractNumId="64" w15:restartNumberingAfterBreak="0">
     <w:nsid w:val="70890CC2"/>
     <w:multiLevelType w:val="multilevel"/>
     <w:tmpl w:val="61B289BE"/>
@@ -42727,7 +43259,7 @@
       </w:rPr>
     </w:lvl>
   </w:abstractNum>
-  <w:abstractNum w:abstractNumId="64" w15:restartNumberingAfterBreak="0">
+  <w:abstractNum w:abstractNumId="65" w15:restartNumberingAfterBreak="0">
     <w:nsid w:val="730D072F"/>
     <w:multiLevelType w:val="multilevel"/>
     <w:tmpl w:val="A43AB75E"/>
@@ -42876,7 +43408,7 @@
       </w:rPr>
     </w:lvl>
   </w:abstractNum>
-  <w:abstractNum w:abstractNumId="65" w15:restartNumberingAfterBreak="0">
+  <w:abstractNum w:abstractNumId="66" w15:restartNumberingAfterBreak="0">
     <w:nsid w:val="752F56E9"/>
     <w:multiLevelType w:val="multilevel"/>
     <w:tmpl w:val="FD22BCD0"/>
@@ -43025,7 +43557,7 @@
       </w:rPr>
     </w:lvl>
   </w:abstractNum>
-  <w:abstractNum w:abstractNumId="66" w15:restartNumberingAfterBreak="0">
+  <w:abstractNum w:abstractNumId="67" w15:restartNumberingAfterBreak="0">
     <w:nsid w:val="78AE70A8"/>
     <w:multiLevelType w:val="multilevel"/>
     <w:tmpl w:val="5AE69808"/>
@@ -43174,7 +43706,7 @@
       </w:rPr>
     </w:lvl>
   </w:abstractNum>
-  <w:abstractNum w:abstractNumId="67" w15:restartNumberingAfterBreak="0">
+  <w:abstractNum w:abstractNumId="68" w15:restartNumberingAfterBreak="0">
     <w:nsid w:val="79544CAF"/>
     <w:multiLevelType w:val="multilevel"/>
     <w:tmpl w:val="4F3AD3D2"/>
@@ -43323,7 +43855,7 @@
       </w:rPr>
     </w:lvl>
   </w:abstractNum>
-  <w:abstractNum w:abstractNumId="68" w15:restartNumberingAfterBreak="0">
+  <w:abstractNum w:abstractNumId="69" w15:restartNumberingAfterBreak="0">
     <w:nsid w:val="7E00233E"/>
     <w:multiLevelType w:val="multilevel"/>
     <w:tmpl w:val="8E0CD8BC"/>
@@ -43500,10 +44032,10 @@
     <w:abstractNumId w:val="46"/>
   </w:num>
   <w:num w:numId="10" w16cid:durableId="1668634257">
-    <w:abstractNumId w:val="67"/>
+    <w:abstractNumId w:val="68"/>
   </w:num>
   <w:num w:numId="11" w16cid:durableId="140851690">
-    <w:abstractNumId w:val="55"/>
+    <w:abstractNumId w:val="56"/>
   </w:num>
   <w:num w:numId="12" w16cid:durableId="1206287632">
     <w:abstractNumId w:val="13"/>
@@ -43527,7 +44059,7 @@
     <w:abstractNumId w:val="42"/>
   </w:num>
   <w:num w:numId="19" w16cid:durableId="549346378">
-    <w:abstractNumId w:val="60"/>
+    <w:abstractNumId w:val="61"/>
   </w:num>
   <w:num w:numId="20" w16cid:durableId="1402680954">
     <w:abstractNumId w:val="45"/>
@@ -43536,13 +44068,13 @@
     <w:abstractNumId w:val="17"/>
   </w:num>
   <w:num w:numId="22" w16cid:durableId="2024285218">
-    <w:abstractNumId w:val="66"/>
+    <w:abstractNumId w:val="67"/>
   </w:num>
   <w:num w:numId="23" w16cid:durableId="1574126638">
     <w:abstractNumId w:val="16"/>
   </w:num>
   <w:num w:numId="24" w16cid:durableId="1989935379">
-    <w:abstractNumId w:val="54"/>
+    <w:abstractNumId w:val="55"/>
   </w:num>
   <w:num w:numId="25" w16cid:durableId="1624462699">
     <w:abstractNumId w:val="43"/>
@@ -43566,7 +44098,7 @@
     <w:abstractNumId w:val="4"/>
   </w:num>
   <w:num w:numId="32" w16cid:durableId="446778622">
-    <w:abstractNumId w:val="59"/>
+    <w:abstractNumId w:val="60"/>
   </w:num>
   <w:num w:numId="33" w16cid:durableId="2075617295">
     <w:abstractNumId w:val="34"/>
@@ -43584,10 +44116,10 @@
     <w:abstractNumId w:val="25"/>
   </w:num>
   <w:num w:numId="38" w16cid:durableId="41293941">
-    <w:abstractNumId w:val="65"/>
+    <w:abstractNumId w:val="66"/>
   </w:num>
   <w:num w:numId="39" w16cid:durableId="1849253745">
-    <w:abstractNumId w:val="63"/>
+    <w:abstractNumId w:val="64"/>
   </w:num>
   <w:num w:numId="40" w16cid:durableId="930629334">
     <w:abstractNumId w:val="27"/>
@@ -43614,7 +44146,7 @@
     <w:abstractNumId w:val="47"/>
   </w:num>
   <w:num w:numId="48" w16cid:durableId="2072073800">
-    <w:abstractNumId w:val="53"/>
+    <w:abstractNumId w:val="54"/>
   </w:num>
   <w:num w:numId="49" w16cid:durableId="838350753">
     <w:abstractNumId w:val="21"/>
@@ -43644,25 +44176,25 @@
     <w:abstractNumId w:val="35"/>
   </w:num>
   <w:num w:numId="58" w16cid:durableId="827398961">
-    <w:abstractNumId w:val="68"/>
+    <w:abstractNumId w:val="69"/>
   </w:num>
   <w:num w:numId="59" w16cid:durableId="269821706">
-    <w:abstractNumId w:val="57"/>
+    <w:abstractNumId w:val="58"/>
   </w:num>
   <w:num w:numId="60" w16cid:durableId="1222014905">
-    <w:abstractNumId w:val="52"/>
+    <w:abstractNumId w:val="53"/>
   </w:num>
   <w:num w:numId="61" w16cid:durableId="1927880382">
     <w:abstractNumId w:val="29"/>
   </w:num>
   <w:num w:numId="62" w16cid:durableId="962805773">
-    <w:abstractNumId w:val="56"/>
+    <w:abstractNumId w:val="57"/>
   </w:num>
   <w:num w:numId="63" w16cid:durableId="1109084225">
-    <w:abstractNumId w:val="61"/>
+    <w:abstractNumId w:val="62"/>
   </w:num>
   <w:num w:numId="64" w16cid:durableId="2140030555">
-    <w:abstractNumId w:val="64"/>
+    <w:abstractNumId w:val="65"/>
   </w:num>
   <w:num w:numId="65" w16cid:durableId="610168169">
     <w:abstractNumId w:val="37"/>
@@ -43674,10 +44206,13 @@
     <w:abstractNumId w:val="39"/>
   </w:num>
   <w:num w:numId="68" w16cid:durableId="457915925">
-    <w:abstractNumId w:val="62"/>
+    <w:abstractNumId w:val="63"/>
   </w:num>
   <w:num w:numId="69" w16cid:durableId="1530030366">
-    <w:abstractNumId w:val="58"/>
+    <w:abstractNumId w:val="59"/>
+  </w:num>
+  <w:num w:numId="70" w16cid:durableId="1277516864">
+    <w:abstractNumId w:val="52"/>
   </w:num>
   <w:numIdMacAtCleanup w:val="66"/>
 </w:numbering>

</xml_diff>

<commit_message>
actas completas, necesidades actualizadas, casos de uso vf
</commit_message>
<xml_diff>
--- a/docs/anteproyecto/Espicifiacion casos de uso PT.docx
+++ b/docs/anteproyecto/Espicifiacion casos de uso PT.docx
@@ -1691,21 +1691,7 @@
                 <w:rStyle w:val="Hipervnculo"/>
                 <w:noProof/>
               </w:rPr>
-              <w:t>CU19- Sincro</w:t>
-            </w:r>
-            <w:r>
-              <w:rPr>
-                <w:rStyle w:val="Hipervnculo"/>
-                <w:noProof/>
-              </w:rPr>
-              <w:t>n</w:t>
-            </w:r>
-            <w:r>
-              <w:rPr>
-                <w:rStyle w:val="Hipervnculo"/>
-                <w:noProof/>
-              </w:rPr>
-              <w:t>izar con calendario Externo</w:t>
+              <w:t>CU19- Sincronizar con calendario Externo</w:t>
             </w:r>
             <w:r>
               <w:rPr>
@@ -2780,7 +2766,15 @@
           </w:tcPr>
           <w:p>
             <w:r>
-              <w:t xml:space="preserve">Los datos médicos del alumno son opcionales. El sistema debe informar al alumno que se usan para su propio beneficio y exigir su confirmación expresa. Sin esa confirmación no se crea la cuenta (autoregistro) </w:t>
+              <w:t>Los datos médicos del alumno son opcionales. El sistema debe informar al alumno que se usan para su propio beneficio y exigir su confirmación expresa. Sin esa confirmación no se crea la cuenta (</w:t>
+            </w:r>
+            <w:proofErr w:type="spellStart"/>
+            <w:r>
+              <w:t>autoregistro</w:t>
+            </w:r>
+            <w:proofErr w:type="spellEnd"/>
+            <w:r>
+              <w:t xml:space="preserve">) </w:t>
             </w:r>
             <w:r>
               <w:t>ni se habilita el acceso (alta realizada por la Organización, CU</w:t>
@@ -3300,9 +3294,14 @@
         <w:t xml:space="preserve">CU1- </w:t>
       </w:r>
       <w:r>
-        <w:t>Iniciar Sesion</w:t>
+        <w:t xml:space="preserve">Iniciar </w:t>
+      </w:r>
+      <w:proofErr w:type="spellStart"/>
+      <w:r>
+        <w:t>Sesion</w:t>
       </w:r>
       <w:bookmarkEnd w:id="6"/>
+      <w:proofErr w:type="spellEnd"/>
     </w:p>
     <w:tbl>
       <w:tblPr>
@@ -3470,7 +3469,15 @@
           </w:tcPr>
           <w:p>
             <w:r>
-              <w:t>Must have — puerta de entrada a todo el sistema</w:t>
+              <w:t xml:space="preserve">Must </w:t>
+            </w:r>
+            <w:proofErr w:type="spellStart"/>
+            <w:r>
+              <w:t>have</w:t>
+            </w:r>
+            <w:proofErr w:type="spellEnd"/>
+            <w:r>
+              <w:t xml:space="preserve"> — puerta de entrada a todo el sistema</w:t>
             </w:r>
           </w:p>
         </w:tc>
@@ -4607,7 +4614,15 @@
               <w:t>Must</w:t>
             </w:r>
             <w:r>
-              <w:t xml:space="preserve"> have </w:t>
+              <w:t xml:space="preserve"> </w:t>
+            </w:r>
+            <w:proofErr w:type="spellStart"/>
+            <w:r>
+              <w:t>have</w:t>
+            </w:r>
+            <w:proofErr w:type="spellEnd"/>
+            <w:r>
+              <w:t xml:space="preserve"> </w:t>
             </w:r>
           </w:p>
         </w:tc>
@@ -5269,8 +5284,13 @@
           </w:tcPr>
           <w:p>
             <w:r>
-              <w:t>Must have</w:t>
-            </w:r>
+              <w:t xml:space="preserve">Must </w:t>
+            </w:r>
+            <w:proofErr w:type="spellStart"/>
+            <w:r>
+              <w:t>have</w:t>
+            </w:r>
+            <w:proofErr w:type="spellEnd"/>
           </w:p>
         </w:tc>
       </w:tr>
@@ -6028,8 +6048,13 @@
           </w:tcPr>
           <w:p>
             <w:r>
-              <w:t>Must have</w:t>
-            </w:r>
+              <w:t xml:space="preserve">Must </w:t>
+            </w:r>
+            <w:proofErr w:type="spellStart"/>
+            <w:r>
+              <w:t>have</w:t>
+            </w:r>
+            <w:proofErr w:type="spellEnd"/>
           </w:p>
         </w:tc>
       </w:tr>
@@ -6709,8 +6734,13 @@
           </w:tcPr>
           <w:p>
             <w:r>
-              <w:t>Una persona empieza a entrenar con el PT y este la da de alta para invitarla a habilitar su acceso, en lugar de que se autoregistre</w:t>
-            </w:r>
+              <w:t xml:space="preserve">Una persona empieza a entrenar con el PT y este la da de alta para invitarla a habilitar su acceso, en lugar de que se </w:t>
+            </w:r>
+            <w:proofErr w:type="spellStart"/>
+            <w:r>
+              <w:t>autoregistre</w:t>
+            </w:r>
+            <w:proofErr w:type="spellEnd"/>
           </w:p>
         </w:tc>
       </w:tr>
@@ -6748,7 +6778,15 @@
           </w:tcPr>
           <w:p>
             <w:r>
-              <w:t>Must have — genera el acceso del alumno</w:t>
+              <w:t xml:space="preserve">Must </w:t>
+            </w:r>
+            <w:proofErr w:type="spellStart"/>
+            <w:r>
+              <w:t>have</w:t>
+            </w:r>
+            <w:proofErr w:type="spellEnd"/>
+            <w:r>
+              <w:t xml:space="preserve"> — genera el acceso del alumno</w:t>
             </w:r>
           </w:p>
         </w:tc>
@@ -7983,7 +8021,15 @@
         <w:t>6</w:t>
       </w:r>
       <w:r>
-        <w:t xml:space="preserve"> — Crear cuenta de Alumno (autoregistro)</w:t>
+        <w:t xml:space="preserve"> — Crear cuenta de Alumno (</w:t>
+      </w:r>
+      <w:proofErr w:type="spellStart"/>
+      <w:r>
+        <w:t>autoregistro</w:t>
+      </w:r>
+      <w:proofErr w:type="spellEnd"/>
+      <w:r>
+        <w:t>)</w:t>
       </w:r>
       <w:bookmarkEnd w:id="11"/>
     </w:p>
@@ -8166,8 +8212,13 @@
           </w:tcPr>
           <w:p>
             <w:r>
-              <w:t>Must have</w:t>
-            </w:r>
+              <w:t xml:space="preserve">Must </w:t>
+            </w:r>
+            <w:proofErr w:type="spellStart"/>
+            <w:r>
+              <w:t>have</w:t>
+            </w:r>
+            <w:proofErr w:type="spellEnd"/>
           </w:p>
         </w:tc>
       </w:tr>
@@ -9293,8 +9344,21 @@
           </w:tcPr>
           <w:p>
             <w:r>
-              <w:t>Must have — mecanismo central de vinculación alumno↔Organización</w:t>
-            </w:r>
+              <w:t xml:space="preserve">Must </w:t>
+            </w:r>
+            <w:proofErr w:type="spellStart"/>
+            <w:r>
+              <w:t>have</w:t>
+            </w:r>
+            <w:proofErr w:type="spellEnd"/>
+            <w:r>
+              <w:t xml:space="preserve"> — mecanismo central de vinculación </w:t>
+            </w:r>
+            <w:proofErr w:type="spellStart"/>
+            <w:r>
+              <w:t>alumno↔Organización</w:t>
+            </w:r>
+            <w:proofErr w:type="spellEnd"/>
           </w:p>
         </w:tc>
       </w:tr>
@@ -10217,8 +10281,13 @@
           </w:tcPr>
           <w:p>
             <w:r>
-              <w:t>Must have</w:t>
-            </w:r>
+              <w:t xml:space="preserve">Must </w:t>
+            </w:r>
+            <w:proofErr w:type="spellStart"/>
+            <w:r>
+              <w:t>have</w:t>
+            </w:r>
+            <w:proofErr w:type="spellEnd"/>
           </w:p>
         </w:tc>
       </w:tr>
@@ -11162,9 +11231,19 @@
             <w:hideMark/>
           </w:tcPr>
           <w:p>
-            <w:r>
-              <w:t>Should have</w:t>
-            </w:r>
+            <w:proofErr w:type="spellStart"/>
+            <w:r>
+              <w:t>Should</w:t>
+            </w:r>
+            <w:proofErr w:type="spellEnd"/>
+            <w:r>
+              <w:t xml:space="preserve"> </w:t>
+            </w:r>
+            <w:proofErr w:type="spellStart"/>
+            <w:r>
+              <w:t>have</w:t>
+            </w:r>
+            <w:proofErr w:type="spellEnd"/>
           </w:p>
         </w:tc>
       </w:tr>
@@ -11712,6 +11791,7 @@
         </w:rPr>
         <w:t xml:space="preserve">Flujos de </w:t>
       </w:r>
+      <w:proofErr w:type="spellStart"/>
       <w:r>
         <w:rPr>
           <w:b/>
@@ -11719,6 +11799,7 @@
         </w:rPr>
         <w:t>Excepcion</w:t>
       </w:r>
+      <w:proofErr w:type="spellEnd"/>
     </w:p>
     <w:p>
       <w:pPr>
@@ -12168,8 +12249,13 @@
               <w:ind w:left="360"/>
             </w:pPr>
             <w:r>
-              <w:t>Must have</w:t>
-            </w:r>
+              <w:t xml:space="preserve">Must </w:t>
+            </w:r>
+            <w:proofErr w:type="spellStart"/>
+            <w:r>
+              <w:t>have</w:t>
+            </w:r>
+            <w:proofErr w:type="spellEnd"/>
           </w:p>
         </w:tc>
       </w:tr>
@@ -12617,6 +12703,12 @@
             </w:r>
             <w:r>
               <w:t>)</w:t>
+            </w:r>
+            <w:r>
+              <w:t xml:space="preserve">, </w:t>
+            </w:r>
+            <w:r>
+              <w:t>el porcentaje de asistencia del mes en curso y del anterior (CU18)</w:t>
             </w:r>
             <w:r>
               <w:t xml:space="preserve"> y accesos a cada sección</w:t>
@@ -13135,9 +13227,19 @@
             <w:hideMark/>
           </w:tcPr>
           <w:p>
-            <w:r>
-              <w:t>Should have</w:t>
-            </w:r>
+            <w:proofErr w:type="spellStart"/>
+            <w:r>
+              <w:t>Should</w:t>
+            </w:r>
+            <w:proofErr w:type="spellEnd"/>
+            <w:r>
+              <w:t xml:space="preserve"> </w:t>
+            </w:r>
+            <w:proofErr w:type="spellStart"/>
+            <w:r>
+              <w:t>have</w:t>
+            </w:r>
+            <w:proofErr w:type="spellEnd"/>
           </w:p>
         </w:tc>
       </w:tr>
@@ -14259,8 +14361,13 @@
           </w:tcPr>
           <w:p>
             <w:r>
-              <w:t>Must have</w:t>
-            </w:r>
+              <w:t xml:space="preserve">Must </w:t>
+            </w:r>
+            <w:proofErr w:type="spellStart"/>
+            <w:r>
+              <w:t>have</w:t>
+            </w:r>
+            <w:proofErr w:type="spellEnd"/>
           </w:p>
         </w:tc>
       </w:tr>
@@ -14943,7 +15050,7 @@
           <w:noProof/>
         </w:rPr>
         <w:drawing>
-          <wp:inline distT="0" distB="0" distL="0" distR="0" wp14:anchorId="68F4FA3F" wp14:editId="65672E51">
+          <wp:inline distT="0" distB="0" distL="0" distR="0" wp14:anchorId="68F4FA3F" wp14:editId="3D2FAA98">
             <wp:extent cx="3705308" cy="2881815"/>
             <wp:effectExtent l="0" t="0" r="0" b="0"/>
             <wp:docPr id="2088025934" name="Imagen 3"/>
@@ -15174,8 +15281,13 @@
           </w:tcPr>
           <w:p>
             <w:r>
-              <w:t>Must have</w:t>
-            </w:r>
+              <w:t xml:space="preserve">Must </w:t>
+            </w:r>
+            <w:proofErr w:type="spellStart"/>
+            <w:r>
+              <w:t>have</w:t>
+            </w:r>
+            <w:proofErr w:type="spellEnd"/>
           </w:p>
         </w:tc>
       </w:tr>
@@ -15330,8 +15442,13 @@
           </w:tcPr>
           <w:p>
             <w:r>
-              <w:t>NC6 (gestión de rutinas de entrenamiento) y entrevistas con PTs</w:t>
-            </w:r>
+              <w:t xml:space="preserve">NC6 (gestión de rutinas de entrenamiento) y entrevistas con </w:t>
+            </w:r>
+            <w:proofErr w:type="spellStart"/>
+            <w:r>
+              <w:t>PTs</w:t>
+            </w:r>
+            <w:proofErr w:type="spellEnd"/>
           </w:p>
         </w:tc>
       </w:tr>
@@ -16029,8 +16146,13 @@
               <w:ind w:left="720"/>
             </w:pPr>
             <w:r>
-              <w:t>Must have</w:t>
-            </w:r>
+              <w:t xml:space="preserve">Must </w:t>
+            </w:r>
+            <w:proofErr w:type="spellStart"/>
+            <w:r>
+              <w:t>have</w:t>
+            </w:r>
+            <w:proofErr w:type="spellEnd"/>
           </w:p>
         </w:tc>
       </w:tr>
@@ -16563,8 +16685,13 @@
               <w:ind w:left="720"/>
             </w:pPr>
             <w:r>
-              <w:t>Ve el catálogo con los favoritos de la Organización primero y el resto accesible (CU12), puede filtrar por material y agrega ejercicios al día mediante drag &amp; drop</w:t>
-            </w:r>
+              <w:t xml:space="preserve">Ve el catálogo con los favoritos de la Organización primero y el resto accesible (CU12), puede filtrar por material y agrega ejercicios al día mediante drag &amp; </w:t>
+            </w:r>
+            <w:proofErr w:type="spellStart"/>
+            <w:r>
+              <w:t>drop</w:t>
+            </w:r>
+            <w:proofErr w:type="spellEnd"/>
           </w:p>
         </w:tc>
       </w:tr>
@@ -17289,9 +17416,19 @@
             <w:pPr>
               <w:ind w:left="720"/>
             </w:pPr>
-            <w:r>
-              <w:t>Should have</w:t>
-            </w:r>
+            <w:proofErr w:type="spellStart"/>
+            <w:r>
+              <w:t>Should</w:t>
+            </w:r>
+            <w:proofErr w:type="spellEnd"/>
+            <w:r>
+              <w:t xml:space="preserve"> </w:t>
+            </w:r>
+            <w:proofErr w:type="spellStart"/>
+            <w:r>
+              <w:t>have</w:t>
+            </w:r>
+            <w:proofErr w:type="spellEnd"/>
           </w:p>
         </w:tc>
       </w:tr>
@@ -17755,7 +17892,15 @@
               <w:ind w:left="720"/>
             </w:pPr>
             <w:r>
-              <w:t>Recopila automáticamente el contexto del alumno (edad, sexo, objetivo, background, morbilidades, lesiones, históricos)</w:t>
+              <w:t xml:space="preserve">Recopila automáticamente el contexto del alumno (edad, sexo, objetivo, </w:t>
+            </w:r>
+            <w:proofErr w:type="spellStart"/>
+            <w:r>
+              <w:t>background</w:t>
+            </w:r>
+            <w:proofErr w:type="spellEnd"/>
+            <w:r>
+              <w:t>, morbilidades, lesiones, históricos)</w:t>
             </w:r>
           </w:p>
         </w:tc>
@@ -18206,7 +18351,15 @@
         <w:t xml:space="preserve">ER1 — </w:t>
       </w:r>
       <w:r>
-        <w:t>Falla del servicio de IA al generar el borrador: error técnico o timeout del servicio externo de IA. El sistema informa al PT y ofrece reintentar o armar la rutina manualmente (CU1</w:t>
+        <w:t xml:space="preserve">Falla del servicio de IA al generar el borrador: error técnico o </w:t>
+      </w:r>
+      <w:proofErr w:type="spellStart"/>
+      <w:r>
+        <w:t>timeout</w:t>
+      </w:r>
+      <w:proofErr w:type="spellEnd"/>
+      <w:r>
+        <w:t xml:space="preserve"> del servicio externo de IA. El sistema informa al PT y ofrece reintentar o armar la rutina manualmente (CU1</w:t>
       </w:r>
       <w:r>
         <w:t>4</w:t>
@@ -18494,8 +18647,13 @@
               <w:ind w:left="720"/>
             </w:pPr>
             <w:r>
-              <w:t>Must have</w:t>
-            </w:r>
+              <w:t xml:space="preserve">Must </w:t>
+            </w:r>
+            <w:proofErr w:type="spellStart"/>
+            <w:r>
+              <w:t>have</w:t>
+            </w:r>
+            <w:proofErr w:type="spellEnd"/>
           </w:p>
         </w:tc>
       </w:tr>
@@ -19724,9 +19882,19 @@
             <w:hideMark/>
           </w:tcPr>
           <w:p>
-            <w:r>
-              <w:t>Could have</w:t>
-            </w:r>
+            <w:proofErr w:type="spellStart"/>
+            <w:r>
+              <w:t>Could</w:t>
+            </w:r>
+            <w:proofErr w:type="spellEnd"/>
+            <w:r>
+              <w:t xml:space="preserve"> </w:t>
+            </w:r>
+            <w:proofErr w:type="spellStart"/>
+            <w:r>
+              <w:t>have</w:t>
+            </w:r>
+            <w:proofErr w:type="spellEnd"/>
           </w:p>
         </w:tc>
       </w:tr>
@@ -20082,7 +20250,15 @@
           </w:tcPr>
           <w:p>
             <w:r>
-              <w:t>Indica cómo ubicar el dispositivo (lugar fijo, ángulo y distancia) y informa que el video se usa solo para el análisis y se elimina al terminar. Solicita el permiso de cámara.</w:t>
+              <w:t xml:space="preserve">Indica cómo ubicar el dispositivo (lugar fijo, ángulo y distancia) </w:t>
+            </w:r>
+            <w:proofErr w:type="spellStart"/>
+            <w:r>
+              <w:t>y</w:t>
+            </w:r>
+            <w:proofErr w:type="spellEnd"/>
+            <w:r>
+              <w:t xml:space="preserve"> informa que el video se usa solo para el análisis y se elimina al terminar. Solicita el permiso de cámara.</w:t>
             </w:r>
           </w:p>
         </w:tc>
@@ -20752,8 +20928,13 @@
           </w:tcPr>
           <w:p>
             <w:r>
-              <w:t>Must have</w:t>
-            </w:r>
+              <w:t xml:space="preserve">Must </w:t>
+            </w:r>
+            <w:proofErr w:type="spellStart"/>
+            <w:r>
+              <w:t>have</w:t>
+            </w:r>
+            <w:proofErr w:type="spellEnd"/>
           </w:p>
         </w:tc>
       </w:tr>
@@ -20911,7 +21092,7 @@
           </w:tcPr>
           <w:p>
             <w:r>
-              <w:t>NC5</w:t>
+              <w:t>NC5 (visibilidad de agenda) + NC4 (registro de asistencia)</w:t>
             </w:r>
           </w:p>
         </w:tc>
@@ -21505,14 +21686,7 @@
           <w:b/>
           <w:bCs/>
         </w:rPr>
-        <w:t>A4 – Agregar nota a la agenda</w:t>
-      </w:r>
-      <w:r>
-        <w:rPr>
-          <w:b/>
-          <w:bCs/>
-        </w:rPr>
-        <w:t xml:space="preserve">: </w:t>
+        <w:t xml:space="preserve">A4 – Agregar nota a la agenda: </w:t>
       </w:r>
       <w:r>
         <w:t>El sistema debe permitir al PT agregar notas de texto libre a su agenda, asociadas a una fecha o rango de fechas y opcionalmente a un alumno (por ejemplo, vacaciones, una cancelación del alumno o un examen médico). Las notas solo las ve el PT; las asociadas a un alumno también se muestran en su ficha (CU10).</w:t>
@@ -21943,9 +22117,19 @@
             <w:hideMark/>
           </w:tcPr>
           <w:p>
-            <w:r>
-              <w:t>Could have</w:t>
-            </w:r>
+            <w:proofErr w:type="spellStart"/>
+            <w:r>
+              <w:t>Could</w:t>
+            </w:r>
+            <w:proofErr w:type="spellEnd"/>
+            <w:r>
+              <w:t xml:space="preserve"> </w:t>
+            </w:r>
+            <w:proofErr w:type="spellStart"/>
+            <w:r>
+              <w:t>have</w:t>
+            </w:r>
+            <w:proofErr w:type="spellEnd"/>
           </w:p>
         </w:tc>
       </w:tr>
@@ -22115,7 +22299,7 @@
           </w:tcPr>
           <w:p>
             <w:r>
-              <w:t>Complementar la agenda propia (CU18) con el calendario que el usuario ya usa</w:t>
+              <w:t>NC5 (visibilidad de agenda): complementa la agenda propia (CU18) con el calendario que el usuario ya usa</w:t>
             </w:r>
           </w:p>
         </w:tc>
@@ -22655,6 +22839,7 @@
           <w:b/>
           <w:bCs/>
         </w:rPr>
+        <w:lastRenderedPageBreak/>
         <w:t>Flujos de Error</w:t>
       </w:r>
     </w:p>
@@ -22670,7 +22855,6 @@
           <w:b/>
           <w:bCs/>
         </w:rPr>
-        <w:lastRenderedPageBreak/>
         <w:t>ER1 — El servicio de calendario externo no está disponible:</w:t>
       </w:r>
       <w:r>
@@ -22707,10 +22891,7 @@
         <w:t xml:space="preserve"> el sistema no implementa un calendario propio: se integra con un servicio de calendario externo, que es quien administra el calendario del usuario, igual que en el pago online y en la autenticación.</w:t>
       </w:r>
       <w:r>
-        <w:t xml:space="preserve"> </w:t>
-      </w:r>
-      <w:r>
-        <w:t xml:space="preserve">La app solo le envía las </w:t>
+        <w:t xml:space="preserve"> La app solo le envía las </w:t>
       </w:r>
       <w:r>
         <w:t>s</w:t>
@@ -22956,9 +23137,19 @@
             <w:pPr>
               <w:ind w:left="720"/>
             </w:pPr>
-            <w:r>
-              <w:t>Should have</w:t>
-            </w:r>
+            <w:proofErr w:type="spellStart"/>
+            <w:r>
+              <w:t>Should</w:t>
+            </w:r>
+            <w:proofErr w:type="spellEnd"/>
+            <w:r>
+              <w:t xml:space="preserve"> </w:t>
+            </w:r>
+            <w:proofErr w:type="spellStart"/>
+            <w:r>
+              <w:t>have</w:t>
+            </w:r>
+            <w:proofErr w:type="spellEnd"/>
           </w:p>
         </w:tc>
       </w:tr>
@@ -23820,9 +24011,19 @@
             <w:pPr>
               <w:ind w:left="720"/>
             </w:pPr>
-            <w:r>
-              <w:t>Should have</w:t>
-            </w:r>
+            <w:proofErr w:type="spellStart"/>
+            <w:r>
+              <w:t>Should</w:t>
+            </w:r>
+            <w:proofErr w:type="spellEnd"/>
+            <w:r>
+              <w:t xml:space="preserve"> </w:t>
+            </w:r>
+            <w:proofErr w:type="spellStart"/>
+            <w:r>
+              <w:t>have</w:t>
+            </w:r>
+            <w:proofErr w:type="spellEnd"/>
           </w:p>
         </w:tc>
       </w:tr>
@@ -24983,9 +25184,19 @@
             <w:hideMark/>
           </w:tcPr>
           <w:p>
-            <w:r>
-              <w:t>Could have</w:t>
-            </w:r>
+            <w:proofErr w:type="spellStart"/>
+            <w:r>
+              <w:t>Could</w:t>
+            </w:r>
+            <w:proofErr w:type="spellEnd"/>
+            <w:r>
+              <w:t xml:space="preserve"> </w:t>
+            </w:r>
+            <w:proofErr w:type="spellStart"/>
+            <w:r>
+              <w:t>have</w:t>
+            </w:r>
+            <w:proofErr w:type="spellEnd"/>
           </w:p>
         </w:tc>
       </w:tr>
@@ -25841,7 +26052,23 @@
         <w:t>Nota técnica (para la sección de herramientas, no forma parte del flujo):</w:t>
       </w:r>
       <w:r>
-        <w:t xml:space="preserve"> pasarela de pago prevista: Mercado Pago, por ser la más usada en Uruguay. A confirmar en el diseño técnico: el modelo de cuentas de cobro (split payments con OAuth) y los estados de pago que informa.</w:t>
+        <w:t xml:space="preserve"> pasarela de pago prevista: Mercado Pago, por ser la más usada en Uruguay. A confirmar en el diseño técnico: el modelo de cuentas de cobro (</w:t>
+      </w:r>
+      <w:proofErr w:type="spellStart"/>
+      <w:r>
+        <w:t>split</w:t>
+      </w:r>
+      <w:proofErr w:type="spellEnd"/>
+      <w:r>
+        <w:t xml:space="preserve"> </w:t>
+      </w:r>
+      <w:proofErr w:type="spellStart"/>
+      <w:r>
+        <w:t>payments</w:t>
+      </w:r>
+      <w:proofErr w:type="spellEnd"/>
+      <w:r>
+        <w:t xml:space="preserve"> con OAuth) y los estados de pago que informa.</w:t>
       </w:r>
     </w:p>
     <w:p/>
@@ -26131,8 +26358,21 @@
             <w:pPr>
               <w:ind w:left="720"/>
             </w:pPr>
-            <w:r>
-              <w:t xml:space="preserve">Could have </w:t>
+            <w:proofErr w:type="spellStart"/>
+            <w:r>
+              <w:t>Could</w:t>
+            </w:r>
+            <w:proofErr w:type="spellEnd"/>
+            <w:r>
+              <w:t xml:space="preserve"> </w:t>
+            </w:r>
+            <w:proofErr w:type="spellStart"/>
+            <w:r>
+              <w:t>have</w:t>
+            </w:r>
+            <w:proofErr w:type="spellEnd"/>
+            <w:r>
+              <w:t xml:space="preserve"> </w:t>
             </w:r>
           </w:p>
         </w:tc>
@@ -26294,7 +26534,7 @@
               <w:ind w:left="720"/>
             </w:pPr>
             <w:r>
-              <w:t>Transversal — ampliación de producto</w:t>
+              <w:t>NC1 (evolución en el tiempo) — ampliación de producto</w:t>
             </w:r>
           </w:p>
         </w:tc>
@@ -27092,12 +27332,19 @@
             <w:pPr>
               <w:ind w:left="720"/>
             </w:pPr>
-            <w:r>
-              <w:t xml:space="preserve">Could </w:t>
-            </w:r>
+            <w:proofErr w:type="spellStart"/>
+            <w:r>
+              <w:t>Could</w:t>
+            </w:r>
+            <w:proofErr w:type="spellEnd"/>
+            <w:r>
+              <w:t xml:space="preserve"> </w:t>
+            </w:r>
+            <w:proofErr w:type="spellStart"/>
             <w:r>
               <w:t>have</w:t>
             </w:r>
+            <w:proofErr w:type="spellEnd"/>
           </w:p>
         </w:tc>
       </w:tr>
@@ -27252,7 +27499,7 @@
               <w:ind w:left="720"/>
             </w:pPr>
             <w:r>
-              <w:t>Transversal — ampliación de producto</w:t>
+              <w:t>NC1 (evolución en el tiempo) — ampliación de producto</w:t>
             </w:r>
           </w:p>
         </w:tc>
@@ -28024,12 +28271,19 @@
             <w:pPr>
               <w:ind w:left="720"/>
             </w:pPr>
+            <w:proofErr w:type="spellStart"/>
             <w:r>
               <w:t>Could</w:t>
             </w:r>
-            <w:r>
-              <w:t xml:space="preserve"> have</w:t>
-            </w:r>
+            <w:proofErr w:type="spellEnd"/>
+            <w:r>
+              <w:t xml:space="preserve"> </w:t>
+            </w:r>
+            <w:proofErr w:type="spellStart"/>
+            <w:r>
+              <w:t>have</w:t>
+            </w:r>
+            <w:proofErr w:type="spellEnd"/>
           </w:p>
         </w:tc>
       </w:tr>
@@ -28185,7 +28439,7 @@
               <w:ind w:left="720"/>
             </w:pPr>
             <w:r>
-              <w:t>Transversal — ampliación de producto</w:t>
+              <w:t>NC1 (evolución en el tiempo) — ampliación de producto</w:t>
             </w:r>
           </w:p>
         </w:tc>
@@ -28813,12 +29067,19 @@
             <w:pPr>
               <w:ind w:left="720"/>
             </w:pPr>
+            <w:proofErr w:type="spellStart"/>
             <w:r>
               <w:t>Could</w:t>
             </w:r>
-            <w:r>
-              <w:t xml:space="preserve"> have</w:t>
-            </w:r>
+            <w:proofErr w:type="spellEnd"/>
+            <w:r>
+              <w:t xml:space="preserve"> </w:t>
+            </w:r>
+            <w:proofErr w:type="spellStart"/>
+            <w:r>
+              <w:t>have</w:t>
+            </w:r>
+            <w:proofErr w:type="spellEnd"/>
           </w:p>
         </w:tc>
       </w:tr>
@@ -28974,7 +29235,7 @@
               <w:ind w:left="720"/>
             </w:pPr>
             <w:r>
-              <w:t>Transversal — ampliación de producto</w:t>
+              <w:t>NC1 (evolución en el tiempo) — ampliación de producto</w:t>
             </w:r>
           </w:p>
         </w:tc>
@@ -29682,9 +29943,19 @@
             <w:pPr>
               <w:ind w:left="720"/>
             </w:pPr>
-            <w:r>
-              <w:t>Could have</w:t>
-            </w:r>
+            <w:proofErr w:type="spellStart"/>
+            <w:r>
+              <w:t>Could</w:t>
+            </w:r>
+            <w:proofErr w:type="spellEnd"/>
+            <w:r>
+              <w:t xml:space="preserve"> </w:t>
+            </w:r>
+            <w:proofErr w:type="spellStart"/>
+            <w:r>
+              <w:t>have</w:t>
+            </w:r>
+            <w:proofErr w:type="spellEnd"/>
           </w:p>
         </w:tc>
       </w:tr>
@@ -30678,7 +30949,15 @@
           </w:tcPr>
           <w:p>
             <w:r>
-              <w:t>Must have — punto de entrada principal para operar el día a día</w:t>
+              <w:t xml:space="preserve">Must </w:t>
+            </w:r>
+            <w:proofErr w:type="spellStart"/>
+            <w:r>
+              <w:t>have</w:t>
+            </w:r>
+            <w:proofErr w:type="spellEnd"/>
+            <w:r>
+              <w:t xml:space="preserve"> — punto de entrada principal para operar el día a día</w:t>
             </w:r>
           </w:p>
         </w:tc>
@@ -31665,8 +31944,13 @@
               <w:ind w:left="720"/>
             </w:pPr>
             <w:r>
-              <w:t>Must have</w:t>
-            </w:r>
+              <w:t xml:space="preserve">Must </w:t>
+            </w:r>
+            <w:proofErr w:type="spellStart"/>
+            <w:r>
+              <w:t>have</w:t>
+            </w:r>
+            <w:proofErr w:type="spellEnd"/>
           </w:p>
         </w:tc>
       </w:tr>
@@ -32029,10 +32313,7 @@
               <w:t xml:space="preserve">Muestra su próxima sesión o </w:t>
             </w:r>
             <w:r>
-              <w:t>evaluación física agendada</w:t>
-            </w:r>
-            <w:r>
-              <w:t xml:space="preserve"> </w:t>
+              <w:t xml:space="preserve">evaluación física agendada </w:t>
             </w:r>
             <w:r>
               <w:t>(CU20)</w:t>
@@ -32245,10 +32526,7 @@
               <w:t>,</w:t>
             </w:r>
             <w:r>
-              <w:t xml:space="preserve"> </w:t>
-            </w:r>
-            <w:r>
-              <w:t>próximas sesiones (CU20)</w:t>
+              <w:t xml:space="preserve"> próximas sesiones (CU20)</w:t>
             </w:r>
             <w:r>
               <w:t xml:space="preserve">, </w:t>
@@ -32361,8 +32639,13 @@
         <w:t>ER1 — Falla al cargar un bloque puntual:</w:t>
       </w:r>
       <w:r>
-        <w:t xml:space="preserve"> error técnico en una sección del Home (ej</w:t>
-      </w:r>
+        <w:t xml:space="preserve"> error técnico en una sección del Home (</w:t>
+      </w:r>
+      <w:proofErr w:type="spellStart"/>
+      <w:r>
+        <w:t>ej</w:t>
+      </w:r>
+      <w:proofErr w:type="spellEnd"/>
       <w:r>
         <w:t xml:space="preserve"> : </w:t>
       </w:r>
@@ -32686,9 +32969,19 @@
             <w:pPr>
               <w:ind w:left="720"/>
             </w:pPr>
-            <w:r>
-              <w:t>Could have</w:t>
-            </w:r>
+            <w:proofErr w:type="spellStart"/>
+            <w:r>
+              <w:t>Could</w:t>
+            </w:r>
+            <w:proofErr w:type="spellEnd"/>
+            <w:r>
+              <w:t xml:space="preserve"> </w:t>
+            </w:r>
+            <w:proofErr w:type="spellStart"/>
+            <w:r>
+              <w:t>have</w:t>
+            </w:r>
+            <w:proofErr w:type="spellEnd"/>
           </w:p>
         </w:tc>
       </w:tr>

</xml_diff>